<commit_message>
Deploy preview for PR 101 🛫
</commit_message>
<xml_diff>
--- a/pr-preview/pr-101/chapters/17-causal-survival-analysis-tracked-changes.docx
+++ b/pr-preview/pr-101/chapters/17-causal-survival-analysis-tracked-changes.docx
@@ -1515,7 +1515,30 @@
               <w:t xml:space="preserve"> (Discrete-time hazards). </w:t>
             </w:r>
             <w:r>
-              <w:t xml:space="preserve">Strictly speaking this is a discrete-time hazard, defined for time measured in intervals rather than continuously.</w:t>
+              <w:t xml:space="preserve">Strictly speaking, the hazard of</w:t>
+            </w:r>
+            <w:r>
+              <w:t xml:space="preserve"> </w:t>
+            </w:r>
+            <w:hyperlink w:anchor="def-survival-risk-hazard-time">
+              <w:r>
+                <w:rPr>
+                  <w:rStyle w:val="Hyperlink"/>
+                </w:rPr>
+                <w:t xml:space="preserve">Definition 2</w:t>
+              </w:r>
+            </w:hyperlink>
+            <w:r>
+              <w:t xml:space="preserve"> </w:t>
+            </w:r>
+            <w:r>
+              <w:t xml:space="preserve">is a discrete-time hazard,</w:t>
+            </w:r>
+            <w:r>
+              <w:t xml:space="preserve"> </w:t>
+            </w:r>
+            <w:r>
+              <w:t xml:space="preserve">defined for time measured in intervals rather than continuously.</w:t>
             </w:r>
             <w:r>
               <w:t xml:space="preserve"> </w:t>
@@ -3897,7 +3920,138 @@
               <w:t xml:space="preserve"> </w:t>
             </w:r>
             <w:r>
-              <w:t xml:space="preserve">For every</w:t>
+              <w:t xml:space="preserve">Suppose</w:t>
+            </w:r>
+            <w:r>
+              <w:t xml:space="preserve"> </w:t>
+            </w:r>
+            <m:oMath>
+              <m:sSub>
+                <m:e>
+                  <m:r>
+                    <m:t>D</m:t>
+                  </m:r>
+                </m:e>
+                <m:sub>
+                  <m:r>
+                    <m:t>0</m:t>
+                  </m:r>
+                </m:sub>
+              </m:sSub>
+              <m:r>
+                <m:rPr>
+                  <m:sty m:val="p"/>
+                </m:rPr>
+                <m:t>=</m:t>
+              </m:r>
+              <m:r>
+                <m:t>0</m:t>
+              </m:r>
+            </m:oMath>
+            <w:r>
+              <w:t xml:space="preserve"> </w:t>
+            </w:r>
+            <w:r>
+              <w:t xml:space="preserve">for everyone and that</w:t>
+            </w:r>
+            <w:r>
+              <w:t xml:space="preserve"> </w:t>
+            </w:r>
+            <m:oMath>
+              <m:sSub>
+                <m:e>
+                  <m:r>
+                    <m:t>D</m:t>
+                  </m:r>
+                </m:e>
+                <m:sub>
+                  <m:r>
+                    <m:t>m</m:t>
+                  </m:r>
+                  <m:r>
+                    <m:rPr>
+                      <m:sty m:val="p"/>
+                    </m:rPr>
+                    <m:t>−</m:t>
+                  </m:r>
+                  <m:r>
+                    <m:t>1</m:t>
+                  </m:r>
+                </m:sub>
+              </m:sSub>
+              <m:r>
+                <m:rPr>
+                  <m:sty m:val="p"/>
+                </m:rPr>
+                <m:t>=</m:t>
+              </m:r>
+              <m:r>
+                <m:t>1</m:t>
+              </m:r>
+            </m:oMath>
+            <w:r>
+              <w:t xml:space="preserve"> </w:t>
+            </w:r>
+            <w:r>
+              <w:t xml:space="preserve">implies</w:t>
+            </w:r>
+            <w:r>
+              <w:t xml:space="preserve"> </w:t>
+            </w:r>
+            <m:oMath>
+              <m:sSub>
+                <m:e>
+                  <m:r>
+                    <m:t>D</m:t>
+                  </m:r>
+                </m:e>
+                <m:sub>
+                  <m:r>
+                    <m:t>m</m:t>
+                  </m:r>
+                </m:sub>
+              </m:sSub>
+              <m:r>
+                <m:rPr>
+                  <m:sty m:val="p"/>
+                </m:rPr>
+                <m:t>=</m:t>
+              </m:r>
+              <m:r>
+                <m:t>1</m:t>
+              </m:r>
+            </m:oMath>
+            <w:r>
+              <w:t xml:space="preserve"> </w:t>
+            </w:r>
+            <w:r>
+              <w:t xml:space="preserve">for every</w:t>
+            </w:r>
+            <w:r>
+              <w:t xml:space="preserve"> </w:t>
+            </w:r>
+            <m:oMath>
+              <m:r>
+                <m:t>m</m:t>
+              </m:r>
+              <m:r>
+                <m:rPr>
+                  <m:sty m:val="p"/>
+                </m:rPr>
+                <m:t>≥</m:t>
+              </m:r>
+              <m:r>
+                <m:t>1</m:t>
+              </m:r>
+            </m:oMath>
+            <w:r>
+              <w:t xml:space="preserve">.</w:t>
+            </w:r>
+            <w:r>
+              <w:t xml:space="preserve"> </w:t>
+            </w:r>
+            <w:r>
+              <w:t xml:space="preserve">Then for every</w:t>
             </w:r>
             <w:r>
               <w:t xml:space="preserve"> </w:t>
@@ -10034,6 +10188,16 @@
         <w:t xml:space="preserve">.</w:t>
       </w:r>
     </w:p>
+    <w:p>
+      <w:pPr>
+        <w:pStyle w:val="BodyText"/>
+      </w:pPr>
+      <w:ins w:id="38" w:author="PR Preview" w:date="2024-01-01T00:00:00Z">
+        <w:r>
+          <w:t xml:space="preserve">Things change with staggered entry.</w:t>
+        </w:r>
+      </w:ins>
+    </w:p>
     <w:tbl>
       <w:tblPr>
         <w:tblStyle w:val="Table"/>
@@ -10084,7 +10248,7 @@
               <w:t xml:space="preserve"> </w:t>
             </w:r>
             <w:r>
-              <w:t xml:space="preserve">Things change with</w:t>
+              <w:t xml:space="preserve">Under</w:t>
             </w:r>
             <w:r>
               <w:t xml:space="preserve"> </w:t>
@@ -10097,7 +10261,7 @@
               <w:t xml:space="preserve">staggered entry</w:t>
             </w:r>
             <w:r>
-              <w:t xml:space="preserve">, where people enter the study on different dates while the study closes on one date.</w:t>
+              <w:t xml:space="preserve">, people enter the study on different dates while the study closes on one date.</w:t>
             </w:r>
             <w:r>
               <w:t xml:space="preserve"> </w:t>
@@ -10175,7 +10339,7 @@
               <w:t xml:space="preserve"> </w:t>
             </w:r>
             <w:r>
-              <w:t xml:space="preserve">We therefore add a time-varying</w:t>
+              <w:t xml:space="preserve">The time-varying</w:t>
             </w:r>
             <w:r>
               <w:t xml:space="preserve"> </w:t>
@@ -10205,13 +10369,10 @@
               </m:sSub>
             </m:oMath>
             <w:r>
-              <w:t xml:space="preserve">,</w:t>
-            </w:r>
-            <w:r>
-              <w:t xml:space="preserve"> </w:t>
-            </w:r>
-            <w:r>
-              <w:t xml:space="preserve">equal to 0 if the person’s administrative end of follow-up lies beyond</w:t>
+              <w:t xml:space="preserve"> </w:t>
+            </w:r>
+            <w:r>
+              <w:t xml:space="preserve">equals 0 if the person’s administrative end of follow-up lies at or beyond</w:t>
             </w:r>
             <w:r>
               <w:t xml:space="preserve"> </w:t>
@@ -10275,105 +10436,6 @@
             </m:oMath>
             <w:r>
               <w:t xml:space="preserve">.</w:t>
-            </w:r>
-            <w:r>
-              <w:t xml:space="preserve"> </w:t>
-            </w:r>
-            <w:r>
-              <w:t xml:space="preserve">The NHEFS dataset omits this variable because</w:t>
-            </w:r>
-            <w:r>
-              <w:t xml:space="preserve"> </w:t>
-            </w:r>
-            <m:oMath>
-              <m:sSub>
-                <m:e>
-                  <m:r>
-                    <m:t>C</m:t>
-                  </m:r>
-                </m:e>
-                <m:sub>
-                  <m:r>
-                    <m:t>k</m:t>
-                  </m:r>
-                  <m:r>
-                    <m:rPr>
-                      <m:sty m:val="p"/>
-                    </m:rPr>
-                    <m:t>+</m:t>
-                  </m:r>
-                  <m:r>
-                    <m:t>1</m:t>
-                  </m:r>
-                </m:sub>
-              </m:sSub>
-              <m:r>
-                <m:rPr>
-                  <m:sty m:val="p"/>
-                </m:rPr>
-                <m:t>=</m:t>
-              </m:r>
-              <m:r>
-                <m:t>0</m:t>
-              </m:r>
-            </m:oMath>
-            <w:r>
-              <w:t xml:space="preserve"> </w:t>
-            </w:r>
-            <w:r>
-              <w:t xml:space="preserve">for everyone at all</w:t>
-            </w:r>
-            <w:r>
-              <w:t xml:space="preserve"> </w:t>
-            </w:r>
-            <m:oMath>
-              <m:r>
-                <m:t>k</m:t>
-              </m:r>
-            </m:oMath>
-            <w:r>
-              <w:t xml:space="preserve"> </w:t>
-            </w:r>
-            <w:r>
-              <w:t xml:space="preserve">before 120 months;</w:t>
-            </w:r>
-            <w:r>
-              <w:t xml:space="preserve"> </w:t>
-            </w:r>
-            <w:r>
-              <w:t xml:space="preserve">with individual-specific administrative censoring,</w:t>
-            </w:r>
-            <w:r>
-              <w:t xml:space="preserve"> </w:t>
-            </w:r>
-            <m:oMath>
-              <m:sSub>
-                <m:e>
-                  <m:r>
-                    <m:t>C</m:t>
-                  </m:r>
-                </m:e>
-                <m:sub>
-                  <m:r>
-                    <m:t>k</m:t>
-                  </m:r>
-                  <m:r>
-                    <m:rPr>
-                      <m:sty m:val="p"/>
-                    </m:rPr>
-                    <m:t>+</m:t>
-                  </m:r>
-                  <m:r>
-                    <m:t>1</m:t>
-                  </m:r>
-                </m:sub>
-              </m:sSub>
-            </m:oMath>
-            <w:r>
-              <w:t xml:space="preserve"> </w:t>
-            </w:r>
-            <w:r>
-              <w:t xml:space="preserve">switches from 0 to 1 at different times for different people.</w:t>
             </w:r>
           </w:p>
           <w:bookmarkEnd w:id="42"/>
@@ -10384,9 +10446,124 @@
       <w:pPr>
         <w:pStyle w:val="BodyText"/>
       </w:pPr>
-      <w:ins w:id="39" w:author="PR Preview" w:date="2024-01-01T00:00:00Z">
+      <w:ins w:id="40" w:author="PR Preview" w:date="2024-01-01T00:00:00Z">
+        <w:r>
+          <w:t xml:space="preserve">The NHEFS dataset omits this variable because</w:t>
+        </w:r>
+      </w:ins>
+      <w:ins w:id="40" w:author="PR Preview" w:date="2024-01-01T00:00:00Z">
         <w:r>
           <w:t xml:space="preserve"> </w:t>
+        </w:r>
+      </w:ins>
+      <m:oMath>
+        <m:sSub>
+          <m:e>
+            <m:r>
+              <m:t>C</m:t>
+            </m:r>
+          </m:e>
+          <m:sub>
+            <m:r>
+              <m:t>k</m:t>
+            </m:r>
+            <m:r>
+              <m:rPr>
+                <m:sty m:val="p"/>
+              </m:rPr>
+              <m:t>+</m:t>
+            </m:r>
+            <m:r>
+              <m:t>1</m:t>
+            </m:r>
+          </m:sub>
+        </m:sSub>
+        <m:r>
+          <m:rPr>
+            <m:sty m:val="p"/>
+          </m:rPr>
+          <m:t>=</m:t>
+        </m:r>
+        <m:r>
+          <m:t>0</m:t>
+        </m:r>
+      </m:oMath>
+      <w:ins w:id="40" w:author="PR Preview" w:date="2024-01-01T00:00:00Z">
+        <w:r>
+          <w:t xml:space="preserve"> </w:t>
+        </w:r>
+      </w:ins>
+      <w:ins w:id="40" w:author="PR Preview" w:date="2024-01-01T00:00:00Z">
+        <w:r>
+          <w:t xml:space="preserve">for everyone at all</w:t>
+        </w:r>
+      </w:ins>
+      <w:ins w:id="40" w:author="PR Preview" w:date="2024-01-01T00:00:00Z">
+        <w:r>
+          <w:t xml:space="preserve"> </w:t>
+        </w:r>
+      </w:ins>
+      <m:oMath>
+        <m:r>
+          <m:t>k</m:t>
+        </m:r>
+      </m:oMath>
+      <w:ins w:id="40" w:author="PR Preview" w:date="2024-01-01T00:00:00Z">
+        <w:r>
+          <w:t xml:space="preserve"> </w:t>
+        </w:r>
+      </w:ins>
+      <w:ins w:id="40" w:author="PR Preview" w:date="2024-01-01T00:00:00Z">
+        <w:r>
+          <w:t xml:space="preserve">before 120 months;</w:t>
+        </w:r>
+      </w:ins>
+      <w:ins w:id="40" w:author="PR Preview" w:date="2024-01-01T00:00:00Z">
+        <w:r>
+          <w:t xml:space="preserve"> </w:t>
+        </w:r>
+      </w:ins>
+      <w:ins w:id="40" w:author="PR Preview" w:date="2024-01-01T00:00:00Z">
+        <w:r>
+          <w:t xml:space="preserve">with individual-specific administrative censoring,</w:t>
+        </w:r>
+      </w:ins>
+      <w:ins w:id="40" w:author="PR Preview" w:date="2024-01-01T00:00:00Z">
+        <w:r>
+          <w:t xml:space="preserve"> </w:t>
+        </w:r>
+      </w:ins>
+      <m:oMath>
+        <m:sSub>
+          <m:e>
+            <m:r>
+              <m:t>C</m:t>
+            </m:r>
+          </m:e>
+          <m:sub>
+            <m:r>
+              <m:t>k</m:t>
+            </m:r>
+            <m:r>
+              <m:rPr>
+                <m:sty m:val="p"/>
+              </m:rPr>
+              <m:t>+</m:t>
+            </m:r>
+            <m:r>
+              <m:t>1</m:t>
+            </m:r>
+          </m:sub>
+        </m:sSub>
+      </m:oMath>
+      <w:ins w:id="40" w:author="PR Preview" w:date="2024-01-01T00:00:00Z">
+        <w:r>
+          <w:t xml:space="preserve"> </w:t>
+        </w:r>
+      </w:ins>
+      <w:ins w:id="40" w:author="PR Preview" w:date="2024-01-01T00:00:00Z">
+        <w:r>
+          <w:t xml:space="preserve">switches from 0 to 1 at different times for different people.</w:t>
         </w:r>
       </w:ins>
     </w:p>
@@ -11203,7 +11380,7 @@
       <w:pPr>
         <w:pStyle w:val="BodyText"/>
       </w:pPr>
-      <w:ins w:id="42" w:author="PR Preview" w:date="2024-01-01T00:00:00Z">
+      <w:ins w:id="43" w:author="PR Preview" w:date="2024-01-01T00:00:00Z">
         <w:r>
           <w:t xml:space="preserve"> </w:t>
         </w:r>
@@ -12087,13 +12264,27 @@
               <w:t xml:space="preserve"> </w:t>
             </w:r>
             <w:r>
-              <w:t xml:space="preserve">If censoring is (as if) randomly assigned, the survival</w:t>
+              <w:t xml:space="preserve">Fix a treatment level</w:t>
             </w:r>
             <w:r>
               <w:t xml:space="preserve"> </w:t>
             </w:r>
             <m:oMath>
               <m:r>
+                <m:t>a</m:t>
+              </m:r>
+            </m:oMath>
+            <w:r>
+              <w:t xml:space="preserve"> </w:t>
+            </w:r>
+            <w:r>
+              <w:t xml:space="preserve">with</w:t>
+            </w:r>
+            <w:r>
+              <w:t xml:space="preserve"> </w:t>
+            </w:r>
+            <m:oMath>
+              <m:r>
                 <m:rPr>
                   <m:sty m:val="p"/>
                 </m:rPr>
@@ -12104,16 +12295,94 @@
                   <m:sty m:val="p"/>
                 </m:rPr>
                 <m:t>[</m:t>
+              </m:r>
+              <m:r>
+                <m:t>A</m:t>
+              </m:r>
+              <m:r>
+                <m:rPr>
+                  <m:sty m:val="p"/>
+                </m:rPr>
+                <m:t>=</m:t>
+              </m:r>
+              <m:r>
+                <m:t>a</m:t>
+              </m:r>
+              <m:r>
+                <m:rPr>
+                  <m:sty m:val="p"/>
+                </m:rPr>
+                <m:t>]</m:t>
+              </m:r>
+              <m:r>
+                <m:rPr>
+                  <m:sty m:val="p"/>
+                </m:rPr>
+                <m:t>&gt;</m:t>
+              </m:r>
+              <m:r>
+                <m:t>0</m:t>
+              </m:r>
+            </m:oMath>
+            <w:r>
+              <w:t xml:space="preserve"> </w:t>
+            </w:r>
+            <w:r>
+              <w:t xml:space="preserve">and a time</w:t>
+            </w:r>
+            <w:r>
+              <w:t xml:space="preserve"> </w:t>
+            </w:r>
+            <m:oMath>
+              <m:r>
+                <m:t>k</m:t>
+              </m:r>
+              <m:r>
+                <m:rPr>
+                  <m:sty m:val="p"/>
+                </m:rPr>
+                <m:t>∈</m:t>
+              </m:r>
+              <m:r>
+                <m:rPr>
+                  <m:sty m:val="p"/>
+                </m:rPr>
+                <m:t>{</m:t>
+              </m:r>
+              <m:r>
+                <m:t>1</m:t>
+              </m:r>
+              <m:r>
+                <m:rPr>
+                  <m:sty m:val="p"/>
+                </m:rPr>
+                <m:t>,</m:t>
+              </m:r>
+              <m:r>
+                <m:rPr>
+                  <m:sty m:val="p"/>
+                </m:rPr>
+                <m:t>…</m:t>
+              </m:r>
+              <m:r>
+                <m:rPr>
+                  <m:sty m:val="p"/>
+                </m:rPr>
+                <m:t>,</m:t>
               </m:r>
               <m:sSub>
                 <m:e>
                   <m:r>
-                    <m:t>D</m:t>
+                    <m:t>k</m:t>
                   </m:r>
                 </m:e>
                 <m:sub>
                   <m:r>
-                    <m:t>k</m:t>
+                    <m:rPr>
+                      <m:nor/>
+                      <m:sty m:val="p"/>
+                    </m:rPr>
+                    <m:t>end</m:t>
                   </m:r>
                 </m:sub>
               </m:sSub>
@@ -12121,11 +12390,422 @@
                 <m:rPr>
                   <m:sty m:val="p"/>
                 </m:rPr>
+                <m:t>}</m:t>
+              </m:r>
+            </m:oMath>
+            <w:r>
+              <w:t xml:space="preserve">.</w:t>
+            </w:r>
+            <w:r>
+              <w:t xml:space="preserve"> </w:t>
+            </w:r>
+            <w:r>
+              <w:t xml:space="preserve">Suppose the uncensored event indicators start at zero and never revert,</w:t>
+            </w:r>
+            <w:r>
+              <w:t xml:space="preserve"> </w:t>
+            </w:r>
+            <w:r>
+              <w:t xml:space="preserve">that is,</w:t>
+            </w:r>
+            <w:r>
+              <w:t xml:space="preserve"> </w:t>
+            </w:r>
+            <m:oMath>
+              <m:sSubSup>
+                <m:e>
+                  <m:r>
+                    <m:t>D</m:t>
+                  </m:r>
+                </m:e>
+                <m:sub>
+                  <m:r>
+                    <m:t>0</m:t>
+                  </m:r>
+                </m:sub>
+                <m:sup>
+                  <m:acc>
+                    <m:accPr>
+                      <m:chr m:val="‾"/>
+                    </m:accPr>
+                    <m:e>
+                      <m:r>
+                        <m:t>c</m:t>
+                      </m:r>
+                    </m:e>
+                  </m:acc>
+                  <m:r>
+                    <m:rPr>
+                      <m:sty m:val="p"/>
+                    </m:rPr>
+                    <m:t>=</m:t>
+                  </m:r>
+                  <m:r>
+                    <m:t>0</m:t>
+                  </m:r>
+                </m:sup>
+              </m:sSubSup>
+              <m:r>
+                <m:rPr>
+                  <m:sty m:val="p"/>
+                </m:rPr>
                 <m:t>=</m:t>
               </m:r>
               <m:r>
                 <m:t>0</m:t>
               </m:r>
+            </m:oMath>
+            <w:r>
+              <w:t xml:space="preserve"> </w:t>
+            </w:r>
+            <w:r>
+              <w:t xml:space="preserve">for everyone</w:t>
+            </w:r>
+            <w:r>
+              <w:t xml:space="preserve"> </w:t>
+            </w:r>
+            <w:r>
+              <w:t xml:space="preserve">and</w:t>
+            </w:r>
+            <w:r>
+              <w:t xml:space="preserve"> </w:t>
+            </w:r>
+            <m:oMath>
+              <m:sSubSup>
+                <m:e>
+                  <m:r>
+                    <m:t>D</m:t>
+                  </m:r>
+                </m:e>
+                <m:sub>
+                  <m:r>
+                    <m:t>m</m:t>
+                  </m:r>
+                  <m:r>
+                    <m:rPr>
+                      <m:sty m:val="p"/>
+                    </m:rPr>
+                    <m:t>−</m:t>
+                  </m:r>
+                  <m:r>
+                    <m:t>1</m:t>
+                  </m:r>
+                </m:sub>
+                <m:sup>
+                  <m:acc>
+                    <m:accPr>
+                      <m:chr m:val="‾"/>
+                    </m:accPr>
+                    <m:e>
+                      <m:r>
+                        <m:t>c</m:t>
+                      </m:r>
+                    </m:e>
+                  </m:acc>
+                  <m:r>
+                    <m:rPr>
+                      <m:sty m:val="p"/>
+                    </m:rPr>
+                    <m:t>=</m:t>
+                  </m:r>
+                  <m:r>
+                    <m:t>0</m:t>
+                  </m:r>
+                </m:sup>
+              </m:sSubSup>
+              <m:r>
+                <m:rPr>
+                  <m:sty m:val="p"/>
+                </m:rPr>
+                <m:t>=</m:t>
+              </m:r>
+              <m:r>
+                <m:t>1</m:t>
+              </m:r>
+            </m:oMath>
+            <w:r>
+              <w:t xml:space="preserve"> </w:t>
+            </w:r>
+            <w:r>
+              <w:t xml:space="preserve">implies</w:t>
+            </w:r>
+            <w:r>
+              <w:t xml:space="preserve"> </w:t>
+            </w:r>
+            <m:oMath>
+              <m:sSubSup>
+                <m:e>
+                  <m:r>
+                    <m:t>D</m:t>
+                  </m:r>
+                </m:e>
+                <m:sub>
+                  <m:r>
+                    <m:t>m</m:t>
+                  </m:r>
+                </m:sub>
+                <m:sup>
+                  <m:acc>
+                    <m:accPr>
+                      <m:chr m:val="‾"/>
+                    </m:accPr>
+                    <m:e>
+                      <m:r>
+                        <m:t>c</m:t>
+                      </m:r>
+                    </m:e>
+                  </m:acc>
+                  <m:r>
+                    <m:rPr>
+                      <m:sty m:val="p"/>
+                    </m:rPr>
+                    <m:t>=</m:t>
+                  </m:r>
+                  <m:r>
+                    <m:t>0</m:t>
+                  </m:r>
+                </m:sup>
+              </m:sSubSup>
+              <m:r>
+                <m:rPr>
+                  <m:sty m:val="p"/>
+                </m:rPr>
+                <m:t>=</m:t>
+              </m:r>
+              <m:r>
+                <m:t>1</m:t>
+              </m:r>
+            </m:oMath>
+            <w:r>
+              <w:t xml:space="preserve"> </w:t>
+            </w:r>
+            <w:r>
+              <w:t xml:space="preserve">for every</w:t>
+            </w:r>
+            <w:r>
+              <w:t xml:space="preserve"> </w:t>
+            </w:r>
+            <m:oMath>
+              <m:r>
+                <m:t>m</m:t>
+              </m:r>
+              <m:r>
+                <m:rPr>
+                  <m:sty m:val="p"/>
+                </m:rPr>
+                <m:t>≥</m:t>
+              </m:r>
+              <m:r>
+                <m:t>1</m:t>
+              </m:r>
+            </m:oMath>
+            <w:r>
+              <w:t xml:space="preserve">.</w:t>
+            </w:r>
+            <w:r>
+              <w:t xml:space="preserve"> </w:t>
+            </w:r>
+            <w:r>
+              <w:t xml:space="preserve">Suppose also that, for every</w:t>
+            </w:r>
+            <w:r>
+              <w:t xml:space="preserve"> </w:t>
+            </w:r>
+            <m:oMath>
+              <m:r>
+                <m:t>m</m:t>
+              </m:r>
+              <m:r>
+                <m:rPr>
+                  <m:sty m:val="p"/>
+                </m:rPr>
+                <m:t>=</m:t>
+              </m:r>
+              <m:r>
+                <m:t>1</m:t>
+              </m:r>
+              <m:r>
+                <m:rPr>
+                  <m:sty m:val="p"/>
+                </m:rPr>
+                <m:t>,</m:t>
+              </m:r>
+              <m:r>
+                <m:rPr>
+                  <m:sty m:val="p"/>
+                </m:rPr>
+                <m:t>…</m:t>
+              </m:r>
+              <m:r>
+                <m:rPr>
+                  <m:sty m:val="p"/>
+                </m:rPr>
+                <m:t>,</m:t>
+              </m:r>
+              <m:r>
+                <m:t>k</m:t>
+              </m:r>
+            </m:oMath>
+            <w:r>
+              <w:t xml:space="preserve">:</w:t>
+            </w:r>
+          </w:p>
+          <w:p>
+            <w:pPr>
+              <w:pStyle w:val="Compact"/>
+              <w:numPr>
+                <w:ilvl w:val="0"/>
+                <w:numId w:val="1007"/>
+              </w:numPr>
+            </w:pPr>
+            <w:r>
+              <w:rPr>
+                <w:b/>
+                <w:bCs/>
+              </w:rPr>
+              <w:t xml:space="preserve">Censoring as if randomly assigned</w:t>
+            </w:r>
+            <w:r>
+              <w:t xml:space="preserve">: given</w:t>
+            </w:r>
+            <w:r>
+              <w:t xml:space="preserve"> </w:t>
+            </w:r>
+            <m:oMath>
+              <m:r>
+                <m:t>A</m:t>
+              </m:r>
+            </m:oMath>
+            <w:r>
+              <w:t xml:space="preserve"> </w:t>
+            </w:r>
+            <w:r>
+              <w:t xml:space="preserve">and survival without censoring through</w:t>
+            </w:r>
+            <w:r>
+              <w:t xml:space="preserve"> </w:t>
+            </w:r>
+            <m:oMath>
+              <m:r>
+                <m:t>m</m:t>
+              </m:r>
+              <m:r>
+                <m:rPr>
+                  <m:sty m:val="p"/>
+                </m:rPr>
+                <m:t>−</m:t>
+              </m:r>
+              <m:r>
+                <m:t>1</m:t>
+              </m:r>
+            </m:oMath>
+            <w:r>
+              <w:t xml:space="preserve">,</w:t>
+            </w:r>
+            <w:r>
+              <w:t xml:space="preserve"> </w:t>
+            </w:r>
+            <w:r>
+              <w:t xml:space="preserve">being censored by</w:t>
+            </w:r>
+            <w:r>
+              <w:t xml:space="preserve"> </w:t>
+            </w:r>
+            <m:oMath>
+              <m:r>
+                <m:t>m</m:t>
+              </m:r>
+            </m:oMath>
+            <w:r>
+              <w:t xml:space="preserve"> </w:t>
+            </w:r>
+            <w:r>
+              <w:t xml:space="preserve">is independent of the event at</w:t>
+            </w:r>
+            <w:r>
+              <w:t xml:space="preserve"> </w:t>
+            </w:r>
+            <m:oMath>
+              <m:r>
+                <m:t>m</m:t>
+              </m:r>
+            </m:oMath>
+            <w:r>
+              <w:t xml:space="preserve"> </w:t>
+            </w:r>
+            <w:r>
+              <w:t xml:space="preserve">without censoring,</w:t>
+            </w:r>
+            <w:r>
+              <w:t xml:space="preserve"> </w:t>
+            </w:r>
+            <m:oMath>
+              <m:sSub>
+                <m:e>
+                  <m:r>
+                    <m:t>C</m:t>
+                  </m:r>
+                </m:e>
+                <m:sub>
+                  <m:r>
+                    <m:t>m</m:t>
+                  </m:r>
+                </m:sub>
+              </m:sSub>
+              <m:r>
+                <m:rPr>
+                  <m:sty m:val="p"/>
+                </m:rPr>
+                <m:t>⟂</m:t>
+              </m:r>
+              <m:r>
+                <m:t>​</m:t>
+              </m:r>
+              <m:r>
+                <m:t>​</m:t>
+              </m:r>
+              <m:r>
+                <m:t>​</m:t>
+              </m:r>
+              <m:r>
+                <m:rPr>
+                  <m:sty m:val="p"/>
+                </m:rPr>
+                <m:t>⟂</m:t>
+              </m:r>
+              <m:sSubSup>
+                <m:e>
+                  <m:r>
+                    <m:t>D</m:t>
+                  </m:r>
+                </m:e>
+                <m:sub>
+                  <m:r>
+                    <m:t>m</m:t>
+                  </m:r>
+                </m:sub>
+                <m:sup>
+                  <m:acc>
+                    <m:accPr>
+                      <m:chr m:val="‾"/>
+                    </m:accPr>
+                    <m:e>
+                      <m:r>
+                        <m:t>c</m:t>
+                      </m:r>
+                    </m:e>
+                  </m:acc>
+                  <m:r>
+                    <m:rPr>
+                      <m:sty m:val="p"/>
+                    </m:rPr>
+                    <m:t>=</m:t>
+                  </m:r>
+                  <m:r>
+                    <m:t>0</m:t>
+                  </m:r>
+                </m:sup>
+              </m:sSubSup>
               <m:r>
                 <m:rPr>
                   <m:sty m:val="p"/>
@@ -12148,20 +12828,531 @@
                 <m:rPr>
                   <m:sty m:val="p"/>
                 </m:rPr>
+                <m:t>,</m:t>
+              </m:r>
+              <m:sSubSup>
+                <m:e>
+                  <m:r>
+                    <m:t>D</m:t>
+                  </m:r>
+                </m:e>
+                <m:sub>
+                  <m:r>
+                    <m:t>m</m:t>
+                  </m:r>
+                  <m:r>
+                    <m:rPr>
+                      <m:sty m:val="p"/>
+                    </m:rPr>
+                    <m:t>−</m:t>
+                  </m:r>
+                  <m:r>
+                    <m:t>1</m:t>
+                  </m:r>
+                </m:sub>
+                <m:sup>
+                  <m:acc>
+                    <m:accPr>
+                      <m:chr m:val="‾"/>
+                    </m:accPr>
+                    <m:e>
+                      <m:r>
+                        <m:t>c</m:t>
+                      </m:r>
+                    </m:e>
+                  </m:acc>
+                  <m:r>
+                    <m:rPr>
+                      <m:sty m:val="p"/>
+                    </m:rPr>
+                    <m:t>=</m:t>
+                  </m:r>
+                  <m:r>
+                    <m:t>0</m:t>
+                  </m:r>
+                </m:sup>
+              </m:sSubSup>
+              <m:r>
+                <m:rPr>
+                  <m:sty m:val="p"/>
+                </m:rPr>
+                <m:t>=</m:t>
+              </m:r>
+              <m:r>
+                <m:t>0</m:t>
+              </m:r>
+            </m:oMath>
+            <w:r>
+              <w:t xml:space="preserve">;</w:t>
+            </w:r>
+          </w:p>
+          <w:p>
+            <w:pPr>
+              <w:pStyle w:val="Compact"/>
+              <w:numPr>
+                <w:ilvl w:val="0"/>
+                <w:numId w:val="1007"/>
+              </w:numPr>
+            </w:pPr>
+            <w:r>
+              <w:rPr>
+                <w:b/>
+                <w:bCs/>
+              </w:rPr>
+              <w:t xml:space="preserve">Positivity</w:t>
+            </w:r>
+            <w:r>
+              <w:t xml:space="preserve">:</w:t>
+            </w:r>
+            <w:r>
+              <w:t xml:space="preserve"> </w:t>
+            </w:r>
+            <m:oMath>
+              <m:r>
+                <m:rPr>
+                  <m:sty m:val="p"/>
+                </m:rPr>
+                <m:t>Pr</m:t>
+              </m:r>
+              <m:r>
+                <m:rPr>
+                  <m:sty m:val="p"/>
+                </m:rPr>
+                <m:t>[</m:t>
+              </m:r>
+              <m:sSub>
+                <m:e>
+                  <m:r>
+                    <m:t>C</m:t>
+                  </m:r>
+                </m:e>
+                <m:sub>
+                  <m:r>
+                    <m:t>m</m:t>
+                  </m:r>
+                </m:sub>
+              </m:sSub>
+              <m:r>
+                <m:rPr>
+                  <m:sty m:val="p"/>
+                </m:rPr>
+                <m:t>=</m:t>
+              </m:r>
+              <m:r>
+                <m:t>0</m:t>
+              </m:r>
+              <m:r>
+                <m:rPr>
+                  <m:sty m:val="p"/>
+                </m:rPr>
+                <m:t>∣</m:t>
+              </m:r>
+              <m:r>
+                <m:t>A</m:t>
+              </m:r>
+              <m:r>
+                <m:rPr>
+                  <m:sty m:val="p"/>
+                </m:rPr>
+                <m:t>=</m:t>
+              </m:r>
+              <m:r>
+                <m:t>a</m:t>
+              </m:r>
+              <m:r>
+                <m:rPr>
+                  <m:sty m:val="p"/>
+                </m:rPr>
+                <m:t>,</m:t>
+              </m:r>
+              <m:sSubSup>
+                <m:e>
+                  <m:r>
+                    <m:t>D</m:t>
+                  </m:r>
+                </m:e>
+                <m:sub>
+                  <m:r>
+                    <m:t>m</m:t>
+                  </m:r>
+                  <m:r>
+                    <m:rPr>
+                      <m:sty m:val="p"/>
+                    </m:rPr>
+                    <m:t>−</m:t>
+                  </m:r>
+                  <m:r>
+                    <m:t>1</m:t>
+                  </m:r>
+                </m:sub>
+                <m:sup>
+                  <m:acc>
+                    <m:accPr>
+                      <m:chr m:val="‾"/>
+                    </m:accPr>
+                    <m:e>
+                      <m:r>
+                        <m:t>c</m:t>
+                      </m:r>
+                    </m:e>
+                  </m:acc>
+                  <m:r>
+                    <m:rPr>
+                      <m:sty m:val="p"/>
+                    </m:rPr>
+                    <m:t>=</m:t>
+                  </m:r>
+                  <m:r>
+                    <m:t>0</m:t>
+                  </m:r>
+                </m:sup>
+              </m:sSubSup>
+              <m:r>
+                <m:rPr>
+                  <m:sty m:val="p"/>
+                </m:rPr>
+                <m:t>=</m:t>
+              </m:r>
+              <m:r>
+                <m:t>0</m:t>
+              </m:r>
+              <m:r>
+                <m:rPr>
+                  <m:sty m:val="p"/>
+                </m:rPr>
                 <m:t>]</m:t>
               </m:r>
+              <m:r>
+                <m:rPr>
+                  <m:sty m:val="p"/>
+                </m:rPr>
+                <m:t>&gt;</m:t>
+              </m:r>
+              <m:r>
+                <m:t>0</m:t>
+              </m:r>
             </m:oMath>
             <w:r>
               <w:t xml:space="preserve"> </w:t>
             </w:r>
             <w:r>
-              <w:t xml:space="preserve">at</w:t>
+              <w:t xml:space="preserve">and</w:t>
             </w:r>
             <w:r>
               <w:t xml:space="preserve"> </w:t>
             </w:r>
             <m:oMath>
               <m:r>
+                <m:rPr>
+                  <m:sty m:val="p"/>
+                </m:rPr>
+                <m:t>Pr</m:t>
+              </m:r>
+              <m:r>
+                <m:rPr>
+                  <m:sty m:val="p"/>
+                </m:rPr>
+                <m:t>[</m:t>
+              </m:r>
+              <m:sSubSup>
+                <m:e>
+                  <m:r>
+                    <m:t>D</m:t>
+                  </m:r>
+                </m:e>
+                <m:sub>
+                  <m:r>
+                    <m:t>m</m:t>
+                  </m:r>
+                  <m:r>
+                    <m:rPr>
+                      <m:sty m:val="p"/>
+                    </m:rPr>
+                    <m:t>−</m:t>
+                  </m:r>
+                  <m:r>
+                    <m:t>1</m:t>
+                  </m:r>
+                </m:sub>
+                <m:sup>
+                  <m:acc>
+                    <m:accPr>
+                      <m:chr m:val="‾"/>
+                    </m:accPr>
+                    <m:e>
+                      <m:r>
+                        <m:t>c</m:t>
+                      </m:r>
+                    </m:e>
+                  </m:acc>
+                  <m:r>
+                    <m:rPr>
+                      <m:sty m:val="p"/>
+                    </m:rPr>
+                    <m:t>=</m:t>
+                  </m:r>
+                  <m:r>
+                    <m:t>0</m:t>
+                  </m:r>
+                </m:sup>
+              </m:sSubSup>
+              <m:r>
+                <m:rPr>
+                  <m:sty m:val="p"/>
+                </m:rPr>
+                <m:t>=</m:t>
+              </m:r>
+              <m:r>
+                <m:t>0</m:t>
+              </m:r>
+              <m:r>
+                <m:rPr>
+                  <m:sty m:val="p"/>
+                </m:rPr>
+                <m:t>∣</m:t>
+              </m:r>
+              <m:r>
+                <m:t>A</m:t>
+              </m:r>
+              <m:r>
+                <m:rPr>
+                  <m:sty m:val="p"/>
+                </m:rPr>
+                <m:t>=</m:t>
+              </m:r>
+              <m:r>
+                <m:t>a</m:t>
+              </m:r>
+              <m:r>
+                <m:rPr>
+                  <m:sty m:val="p"/>
+                </m:rPr>
+                <m:t>]</m:t>
+              </m:r>
+              <m:r>
+                <m:rPr>
+                  <m:sty m:val="p"/>
+                </m:rPr>
+                <m:t>&gt;</m:t>
+              </m:r>
+              <m:r>
+                <m:t>0</m:t>
+              </m:r>
+            </m:oMath>
+            <w:r>
+              <w:t xml:space="preserve">;</w:t>
+            </w:r>
+          </w:p>
+          <w:p>
+            <w:pPr>
+              <w:pStyle w:val="Compact"/>
+              <w:numPr>
+                <w:ilvl w:val="0"/>
+                <w:numId w:val="1007"/>
+              </w:numPr>
+            </w:pPr>
+            <w:r>
+              <w:rPr>
+                <w:b/>
+                <w:bCs/>
+              </w:rPr>
+              <w:t xml:space="preserve">Consistency</w:t>
+            </w:r>
+            <w:r>
+              <w:t xml:space="preserve">: for anyone with</w:t>
+            </w:r>
+            <w:r>
+              <w:t xml:space="preserve"> </w:t>
+            </w:r>
+            <m:oMath>
+              <m:sSub>
+                <m:e>
+                  <m:r>
+                    <m:t>C</m:t>
+                  </m:r>
+                </m:e>
+                <m:sub>
+                  <m:r>
+                    <m:t>m</m:t>
+                  </m:r>
+                </m:sub>
+              </m:sSub>
+              <m:r>
+                <m:rPr>
+                  <m:sty m:val="p"/>
+                </m:rPr>
+                <m:t>=</m:t>
+              </m:r>
+              <m:r>
+                <m:t>0</m:t>
+              </m:r>
+            </m:oMath>
+            <w:r>
+              <w:t xml:space="preserve">,</w:t>
+            </w:r>
+            <w:r>
+              <w:t xml:space="preserve"> </w:t>
+            </w:r>
+            <m:oMath>
+              <m:sSub>
+                <m:e>
+                  <m:r>
+                    <m:t>D</m:t>
+                  </m:r>
+                </m:e>
+                <m:sub>
+                  <m:r>
+                    <m:t>m</m:t>
+                  </m:r>
+                </m:sub>
+              </m:sSub>
+              <m:r>
+                <m:rPr>
+                  <m:sty m:val="p"/>
+                </m:rPr>
+                <m:t>=</m:t>
+              </m:r>
+              <m:sSubSup>
+                <m:e>
+                  <m:r>
+                    <m:t>D</m:t>
+                  </m:r>
+                </m:e>
+                <m:sub>
+                  <m:r>
+                    <m:t>m</m:t>
+                  </m:r>
+                </m:sub>
+                <m:sup>
+                  <m:acc>
+                    <m:accPr>
+                      <m:chr m:val="‾"/>
+                    </m:accPr>
+                    <m:e>
+                      <m:r>
+                        <m:t>c</m:t>
+                      </m:r>
+                    </m:e>
+                  </m:acc>
+                  <m:r>
+                    <m:rPr>
+                      <m:sty m:val="p"/>
+                    </m:rPr>
+                    <m:t>=</m:t>
+                  </m:r>
+                  <m:r>
+                    <m:t>0</m:t>
+                  </m:r>
+                </m:sup>
+              </m:sSubSup>
+            </m:oMath>
+            <w:r>
+              <w:t xml:space="preserve"> </w:t>
+            </w:r>
+            <w:r>
+              <w:t xml:space="preserve">and</w:t>
+            </w:r>
+            <w:r>
+              <w:t xml:space="preserve"> </w:t>
+            </w:r>
+            <m:oMath>
+              <m:sSub>
+                <m:e>
+                  <m:r>
+                    <m:t>D</m:t>
+                  </m:r>
+                </m:e>
+                <m:sub>
+                  <m:r>
+                    <m:t>m</m:t>
+                  </m:r>
+                  <m:r>
+                    <m:rPr>
+                      <m:sty m:val="p"/>
+                    </m:rPr>
+                    <m:t>−</m:t>
+                  </m:r>
+                  <m:r>
+                    <m:t>1</m:t>
+                  </m:r>
+                </m:sub>
+              </m:sSub>
+              <m:r>
+                <m:rPr>
+                  <m:sty m:val="p"/>
+                </m:rPr>
+                <m:t>=</m:t>
+              </m:r>
+              <m:sSubSup>
+                <m:e>
+                  <m:r>
+                    <m:t>D</m:t>
+                  </m:r>
+                </m:e>
+                <m:sub>
+                  <m:r>
+                    <m:t>m</m:t>
+                  </m:r>
+                  <m:r>
+                    <m:rPr>
+                      <m:sty m:val="p"/>
+                    </m:rPr>
+                    <m:t>−</m:t>
+                  </m:r>
+                  <m:r>
+                    <m:t>1</m:t>
+                  </m:r>
+                </m:sub>
+                <m:sup>
+                  <m:acc>
+                    <m:accPr>
+                      <m:chr m:val="‾"/>
+                    </m:accPr>
+                    <m:e>
+                      <m:r>
+                        <m:t>c</m:t>
+                      </m:r>
+                    </m:e>
+                  </m:acc>
+                  <m:r>
+                    <m:rPr>
+                      <m:sty m:val="p"/>
+                    </m:rPr>
+                    <m:t>=</m:t>
+                  </m:r>
+                  <m:r>
+                    <m:t>0</m:t>
+                  </m:r>
+                </m:sup>
+              </m:sSubSup>
+            </m:oMath>
+            <w:r>
+              <w:t xml:space="preserve">.</w:t>
+            </w:r>
+          </w:p>
+          <w:p>
+            <w:pPr>
+              <w:pStyle w:val="FirstParagraph"/>
+            </w:pPr>
+            <w:r>
+              <w:t xml:space="preserve">Then the survival without censoring (</w:t>
+            </w:r>
+            <w:hyperlink w:anchor="def-survival-without-censoring">
+              <w:r>
+                <w:rPr>
+                  <w:rStyle w:val="Hyperlink"/>
+                </w:rPr>
+                <w:t xml:space="preserve">Definition 9</w:t>
+              </w:r>
+            </w:hyperlink>
+            <w:r>
+              <w:t xml:space="preserve">) at</w:t>
+            </w:r>
+            <w:r>
+              <w:t xml:space="preserve"> </w:t>
+            </w:r>
+            <m:oMath>
+              <m:r>
                 <m:t>k</m:t>
               </m:r>
             </m:oMath>
@@ -12169,7 +13360,7 @@
               <w:t xml:space="preserve"> </w:t>
             </w:r>
             <w:r>
-              <w:t xml:space="preserve">is:</w:t>
+              <w:t xml:space="preserve">is</w:t>
             </w:r>
           </w:p>
           <w:p>
@@ -12193,7 +13384,7 @@
                   </m:rPr>
                   <m:t>[</m:t>
                 </m:r>
-                <m:sSub>
+                <m:sSubSup>
                   <m:e>
                     <m:r>
                       <m:t>D</m:t>
@@ -12204,7 +13395,28 @@
                       <m:t>k</m:t>
                     </m:r>
                   </m:sub>
-                </m:sSub>
+                  <m:sup>
+                    <m:acc>
+                      <m:accPr>
+                        <m:chr m:val="‾"/>
+                      </m:accPr>
+                      <m:e>
+                        <m:r>
+                          <m:t>c</m:t>
+                        </m:r>
+                      </m:e>
+                    </m:acc>
+                    <m:r>
+                      <m:rPr>
+                        <m:sty m:val="p"/>
+                      </m:rPr>
+                      <m:t>=</m:t>
+                    </m:r>
+                    <m:r>
+                      <m:t>0</m:t>
+                    </m:r>
+                  </m:sup>
+                </m:sSubSup>
                 <m:r>
                   <m:rPr>
                     <m:sty m:val="p"/>
@@ -12393,41 +13605,6 @@
                   </m:rPr>
                   <m:t>]</m:t>
                 </m:r>
-                <m:r>
-                  <m:t> </m:t>
-                </m:r>
-                <m:r>
-                  <m:rPr>
-                    <m:nor/>
-                    <m:sty m:val="p"/>
-                  </m:rPr>
-                  <m:t>for </m:t>
-                </m:r>
-                <m:r>
-                  <m:t>k</m:t>
-                </m:r>
-                <m:r>
-                  <m:rPr>
-                    <m:sty m:val="p"/>
-                  </m:rPr>
-                  <m:t>&lt;</m:t>
-                </m:r>
-                <m:sSub>
-                  <m:e>
-                    <m:r>
-                      <m:t>k</m:t>
-                    </m:r>
-                  </m:e>
-                  <m:sub>
-                    <m:r>
-                      <m:rPr>
-                        <m:nor/>
-                        <m:sty m:val="p"/>
-                      </m:rPr>
-                      <m:t>end</m:t>
-                    </m:r>
-                  </m:sub>
-                </m:sSub>
               </m:oMath>
             </m:oMathPara>
           </w:p>
@@ -12439,9 +13616,1216 @@
       <w:pPr>
         <w:pStyle w:val="FirstParagraph"/>
       </w:pPr>
-      <w:ins w:id="44" w:author="PR Preview" w:date="2024-01-01T00:00:00Z">
+      <w:ins w:id="45" w:author="PR Preview" w:date="2024-01-01T00:00:00Z">
         <w:r>
           <w:t xml:space="preserve"> </w:t>
+        </w:r>
+      </w:ins>
+    </w:p>
+    <w:tbl>
+      <w:tblPr>
+        <w:tblStyle w:val="Table"/>
+        <w:tblLook w:firstRow="0" w:lastRow="0" w:firstColumn="0" w:lastColumn="0" w:noHBand="0" w:noVBand="0" w:val="0000"/>
+        <w:tblBorders>
+          <w:top w:val="single" w:sz="4" w:space="0" w:color="909090"/>
+          <w:left w:val="single" w:sz="24" w:space="0" w:color="909090"/>
+          <w:bottom w:val="single" w:sz="4" w:space="0" w:color="909090"/>
+          <w:right w:val="single" w:sz="4" w:space="0" w:color="909090"/>
+        </w:tblBorders>
+        <w:tblCellMar>
+          <w:left w:w="144" w:type="dxa"/>
+          <w:right w:w="144" w:type="dxa"/>
+        </w:tblCellMar>
+        <w:tblLook w:firstRow="0" w:lastRow="0" w:firstColumn="0" w:lastColumn="0" w:noHBand="0" w:noVBand="0" w:val="0000"/>
+      </w:tblPr>
+      <w:tr>
+        <w:trPr>
+          <w:cantSplit/>
+        </w:trPr>
+        <w:tc>
+          <w:tcPr>
+            <w:shd w:color="auto" w:fill="e6e6e6" w:val="clear"/>
+            <w:tcMar>
+              <w:top w:w="92" w:type="dxa"/>
+              <w:bottom w:w="92" w:type="dxa"/>
+            </w:tcMar>
+          </w:tcPr>
+          <w:p>
+            <w:pPr>
+              <w:pStyle w:val="BodyText"/>
+            </w:pPr>
+            <w:pPr>
+              <w:spacing w:before="16" w:after="16"/>
+            </w:pPr>
+            <w:r>
+              <w:t xml:space="preserve">Proof</w:t>
+            </w:r>
+          </w:p>
+        </w:tc>
+      </w:tr>
+      <w:tr>
+        <w:trPr>
+          <w:cantSplit/>
+        </w:trPr>
+        <w:tc>
+          <w:tcPr>
+            <w:tcMar>
+              <w:top w:w="108" w:type="dxa"/>
+              <w:bottom w:w="108" w:type="dxa"/>
+            </w:tcMar>
+          </w:tcPr>
+          <w:p>
+            <w:pPr>
+              <w:pStyle w:val="BodyText"/>
+            </w:pPr>
+            <w:r>
+              <w:rPr>
+                <w:i/>
+                <w:iCs/>
+              </w:rPr>
+              <w:t xml:space="preserve">Proof</w:t>
+            </w:r>
+            <w:r>
+              <w:t xml:space="preserve">. </w:t>
+            </w:r>
+            <w:r>
+              <w:t xml:space="preserve">Applying</w:t>
+            </w:r>
+            <w:r>
+              <w:t xml:space="preserve"> </w:t>
+            </w:r>
+            <w:hyperlink w:anchor="prp-survival-product-of-hazards">
+              <w:r>
+                <w:rPr>
+                  <w:rStyle w:val="Hyperlink"/>
+                </w:rPr>
+                <w:t xml:space="preserve">Proposition 1</w:t>
+              </w:r>
+            </w:hyperlink>
+            <w:r>
+              <w:t xml:space="preserve"> </w:t>
+            </w:r>
+            <w:r>
+              <w:t xml:space="preserve">to the uncensored event indicators</w:t>
+            </w:r>
+            <w:r>
+              <w:t xml:space="preserve"> </w:t>
+            </w:r>
+            <m:oMath>
+              <m:sSubSup>
+                <m:e>
+                  <m:r>
+                    <m:t>D</m:t>
+                  </m:r>
+                </m:e>
+                <m:sub>
+                  <m:r>
+                    <m:t>m</m:t>
+                  </m:r>
+                </m:sub>
+                <m:sup>
+                  <m:acc>
+                    <m:accPr>
+                      <m:chr m:val="‾"/>
+                    </m:accPr>
+                    <m:e>
+                      <m:r>
+                        <m:t>c</m:t>
+                      </m:r>
+                    </m:e>
+                  </m:acc>
+                  <m:r>
+                    <m:rPr>
+                      <m:sty m:val="p"/>
+                    </m:rPr>
+                    <m:t>=</m:t>
+                  </m:r>
+                  <m:r>
+                    <m:t>0</m:t>
+                  </m:r>
+                </m:sup>
+              </m:sSubSup>
+            </m:oMath>
+            <w:r>
+              <w:t xml:space="preserve">, within the stratum</w:t>
+            </w:r>
+            <w:r>
+              <w:t xml:space="preserve"> </w:t>
+            </w:r>
+            <m:oMath>
+              <m:r>
+                <m:t>A</m:t>
+              </m:r>
+              <m:r>
+                <m:rPr>
+                  <m:sty m:val="p"/>
+                </m:rPr>
+                <m:t>=</m:t>
+              </m:r>
+              <m:r>
+                <m:t>a</m:t>
+              </m:r>
+            </m:oMath>
+            <w:r>
+              <w:t xml:space="preserve">, gives</w:t>
+            </w:r>
+          </w:p>
+          <w:p>
+            <w:pPr>
+              <w:pStyle w:val="BodyText"/>
+            </w:pPr>
+            <m:oMathPara>
+              <m:oMathParaPr>
+                <m:jc m:val="center"/>
+              </m:oMathParaPr>
+              <m:oMath>
+                <m:r>
+                  <m:rPr>
+                    <m:sty m:val="p"/>
+                  </m:rPr>
+                  <m:t>Pr</m:t>
+                </m:r>
+                <m:r>
+                  <m:rPr>
+                    <m:sty m:val="p"/>
+                  </m:rPr>
+                  <m:t>[</m:t>
+                </m:r>
+                <m:sSubSup>
+                  <m:e>
+                    <m:r>
+                      <m:t>D</m:t>
+                    </m:r>
+                  </m:e>
+                  <m:sub>
+                    <m:r>
+                      <m:t>k</m:t>
+                    </m:r>
+                  </m:sub>
+                  <m:sup>
+                    <m:acc>
+                      <m:accPr>
+                        <m:chr m:val="‾"/>
+                      </m:accPr>
+                      <m:e>
+                        <m:r>
+                          <m:t>c</m:t>
+                        </m:r>
+                      </m:e>
+                    </m:acc>
+                    <m:r>
+                      <m:rPr>
+                        <m:sty m:val="p"/>
+                      </m:rPr>
+                      <m:t>=</m:t>
+                    </m:r>
+                    <m:r>
+                      <m:t>0</m:t>
+                    </m:r>
+                  </m:sup>
+                </m:sSubSup>
+                <m:r>
+                  <m:rPr>
+                    <m:sty m:val="p"/>
+                  </m:rPr>
+                  <m:t>=</m:t>
+                </m:r>
+                <m:r>
+                  <m:t>0</m:t>
+                </m:r>
+                <m:r>
+                  <m:rPr>
+                    <m:sty m:val="p"/>
+                  </m:rPr>
+                  <m:t>∣</m:t>
+                </m:r>
+                <m:r>
+                  <m:t>A</m:t>
+                </m:r>
+                <m:r>
+                  <m:rPr>
+                    <m:sty m:val="p"/>
+                  </m:rPr>
+                  <m:t>=</m:t>
+                </m:r>
+                <m:r>
+                  <m:t>a</m:t>
+                </m:r>
+                <m:r>
+                  <m:rPr>
+                    <m:sty m:val="p"/>
+                  </m:rPr>
+                  <m:t>]</m:t>
+                </m:r>
+                <m:r>
+                  <m:rPr>
+                    <m:sty m:val="p"/>
+                  </m:rPr>
+                  <m:t>=</m:t>
+                </m:r>
+                <m:nary>
+                  <m:naryPr>
+                    <m:chr m:val="∏"/>
+                    <m:limLoc m:val="undOvr"/>
+                    <m:subHide m:val="off"/>
+                    <m:supHide m:val="off"/>
+                  </m:naryPr>
+                  <m:sub>
+                    <m:r>
+                      <m:t>m</m:t>
+                    </m:r>
+                    <m:r>
+                      <m:rPr>
+                        <m:sty m:val="p"/>
+                      </m:rPr>
+                      <m:t>=</m:t>
+                    </m:r>
+                    <m:r>
+                      <m:t>1</m:t>
+                    </m:r>
+                  </m:sub>
+                  <m:sup>
+                    <m:r>
+                      <m:t>k</m:t>
+                    </m:r>
+                  </m:sup>
+                  <m:e>
+                    <m:r>
+                      <m:rPr>
+                        <m:sty m:val="p"/>
+                      </m:rPr>
+                      <m:t>Pr</m:t>
+                    </m:r>
+                  </m:e>
+                </m:nary>
+                <m:r>
+                  <m:rPr>
+                    <m:sty m:val="p"/>
+                  </m:rPr>
+                  <m:t>[</m:t>
+                </m:r>
+                <m:sSubSup>
+                  <m:e>
+                    <m:r>
+                      <m:t>D</m:t>
+                    </m:r>
+                  </m:e>
+                  <m:sub>
+                    <m:r>
+                      <m:t>m</m:t>
+                    </m:r>
+                  </m:sub>
+                  <m:sup>
+                    <m:acc>
+                      <m:accPr>
+                        <m:chr m:val="‾"/>
+                      </m:accPr>
+                      <m:e>
+                        <m:r>
+                          <m:t>c</m:t>
+                        </m:r>
+                      </m:e>
+                    </m:acc>
+                    <m:r>
+                      <m:rPr>
+                        <m:sty m:val="p"/>
+                      </m:rPr>
+                      <m:t>=</m:t>
+                    </m:r>
+                    <m:r>
+                      <m:t>0</m:t>
+                    </m:r>
+                  </m:sup>
+                </m:sSubSup>
+                <m:r>
+                  <m:rPr>
+                    <m:sty m:val="p"/>
+                  </m:rPr>
+                  <m:t>=</m:t>
+                </m:r>
+                <m:r>
+                  <m:t>0</m:t>
+                </m:r>
+                <m:r>
+                  <m:rPr>
+                    <m:sty m:val="p"/>
+                  </m:rPr>
+                  <m:t>∣</m:t>
+                </m:r>
+                <m:sSubSup>
+                  <m:e>
+                    <m:r>
+                      <m:t>D</m:t>
+                    </m:r>
+                  </m:e>
+                  <m:sub>
+                    <m:r>
+                      <m:t>m</m:t>
+                    </m:r>
+                    <m:r>
+                      <m:rPr>
+                        <m:sty m:val="p"/>
+                      </m:rPr>
+                      <m:t>−</m:t>
+                    </m:r>
+                    <m:r>
+                      <m:t>1</m:t>
+                    </m:r>
+                  </m:sub>
+                  <m:sup>
+                    <m:acc>
+                      <m:accPr>
+                        <m:chr m:val="‾"/>
+                      </m:accPr>
+                      <m:e>
+                        <m:r>
+                          <m:t>c</m:t>
+                        </m:r>
+                      </m:e>
+                    </m:acc>
+                    <m:r>
+                      <m:rPr>
+                        <m:sty m:val="p"/>
+                      </m:rPr>
+                      <m:t>=</m:t>
+                    </m:r>
+                    <m:r>
+                      <m:t>0</m:t>
+                    </m:r>
+                  </m:sup>
+                </m:sSubSup>
+                <m:r>
+                  <m:rPr>
+                    <m:sty m:val="p"/>
+                  </m:rPr>
+                  <m:t>=</m:t>
+                </m:r>
+                <m:r>
+                  <m:t>0</m:t>
+                </m:r>
+                <m:r>
+                  <m:rPr>
+                    <m:sty m:val="p"/>
+                  </m:rPr>
+                  <m:t>,</m:t>
+                </m:r>
+                <m:r>
+                  <m:t>A</m:t>
+                </m:r>
+                <m:r>
+                  <m:rPr>
+                    <m:sty m:val="p"/>
+                  </m:rPr>
+                  <m:t>=</m:t>
+                </m:r>
+                <m:r>
+                  <m:t>a</m:t>
+                </m:r>
+                <m:r>
+                  <m:rPr>
+                    <m:sty m:val="p"/>
+                  </m:rPr>
+                  <m:t>]</m:t>
+                </m:r>
+              </m:oMath>
+            </m:oMathPara>
+          </w:p>
+          <w:p>
+            <w:pPr>
+              <w:pStyle w:val="FirstParagraph"/>
+            </w:pPr>
+            <w:r>
+              <w:t xml:space="preserve">Fix one factor</w:t>
+            </w:r>
+            <w:r>
+              <w:t xml:space="preserve"> </w:t>
+            </w:r>
+            <m:oMath>
+              <m:r>
+                <m:t>m</m:t>
+              </m:r>
+            </m:oMath>
+            <w:r>
+              <w:t xml:space="preserve">.</w:t>
+            </w:r>
+            <w:r>
+              <w:t xml:space="preserve"> </w:t>
+            </w:r>
+            <w:r>
+              <w:t xml:space="preserve">By the independence assumption</w:t>
+            </w:r>
+            <w:r>
+              <w:t xml:space="preserve"> </w:t>
+            </w:r>
+            <w:r>
+              <w:t xml:space="preserve">(with positivity ensuring the added conditioning event has positive probability),</w:t>
+            </w:r>
+            <w:r>
+              <w:t xml:space="preserve"> </w:t>
+            </w:r>
+            <w:r>
+              <w:t xml:space="preserve">adding</w:t>
+            </w:r>
+            <w:r>
+              <w:t xml:space="preserve"> </w:t>
+            </w:r>
+            <m:oMath>
+              <m:sSub>
+                <m:e>
+                  <m:r>
+                    <m:t>C</m:t>
+                  </m:r>
+                </m:e>
+                <m:sub>
+                  <m:r>
+                    <m:t>m</m:t>
+                  </m:r>
+                </m:sub>
+              </m:sSub>
+              <m:r>
+                <m:rPr>
+                  <m:sty m:val="p"/>
+                </m:rPr>
+                <m:t>=</m:t>
+              </m:r>
+              <m:r>
+                <m:t>0</m:t>
+              </m:r>
+            </m:oMath>
+            <w:r>
+              <w:t xml:space="preserve"> </w:t>
+            </w:r>
+            <w:r>
+              <w:t xml:space="preserve">to the conditioning event leaves the factor unchanged:</w:t>
+            </w:r>
+            <w:r>
+              <w:t xml:space="preserve"> </w:t>
+            </w:r>
+            <w:r>
+              <w:t xml:space="preserve">it equals</w:t>
+            </w:r>
+            <w:r>
+              <w:t xml:space="preserve"> </w:t>
+            </w:r>
+            <m:oMath>
+              <m:r>
+                <m:rPr>
+                  <m:sty m:val="p"/>
+                </m:rPr>
+                <m:t>Pr</m:t>
+              </m:r>
+              <m:r>
+                <m:rPr>
+                  <m:sty m:val="p"/>
+                </m:rPr>
+                <m:t>[</m:t>
+              </m:r>
+              <m:sSubSup>
+                <m:e>
+                  <m:r>
+                    <m:t>D</m:t>
+                  </m:r>
+                </m:e>
+                <m:sub>
+                  <m:r>
+                    <m:t>m</m:t>
+                  </m:r>
+                </m:sub>
+                <m:sup>
+                  <m:acc>
+                    <m:accPr>
+                      <m:chr m:val="‾"/>
+                    </m:accPr>
+                    <m:e>
+                      <m:r>
+                        <m:t>c</m:t>
+                      </m:r>
+                    </m:e>
+                  </m:acc>
+                  <m:r>
+                    <m:rPr>
+                      <m:sty m:val="p"/>
+                    </m:rPr>
+                    <m:t>=</m:t>
+                  </m:r>
+                  <m:r>
+                    <m:t>0</m:t>
+                  </m:r>
+                </m:sup>
+              </m:sSubSup>
+              <m:r>
+                <m:rPr>
+                  <m:sty m:val="p"/>
+                </m:rPr>
+                <m:t>=</m:t>
+              </m:r>
+              <m:r>
+                <m:t>0</m:t>
+              </m:r>
+              <m:r>
+                <m:rPr>
+                  <m:sty m:val="p"/>
+                </m:rPr>
+                <m:t>∣</m:t>
+              </m:r>
+              <m:sSubSup>
+                <m:e>
+                  <m:r>
+                    <m:t>D</m:t>
+                  </m:r>
+                </m:e>
+                <m:sub>
+                  <m:r>
+                    <m:t>m</m:t>
+                  </m:r>
+                  <m:r>
+                    <m:rPr>
+                      <m:sty m:val="p"/>
+                    </m:rPr>
+                    <m:t>−</m:t>
+                  </m:r>
+                  <m:r>
+                    <m:t>1</m:t>
+                  </m:r>
+                </m:sub>
+                <m:sup>
+                  <m:acc>
+                    <m:accPr>
+                      <m:chr m:val="‾"/>
+                    </m:accPr>
+                    <m:e>
+                      <m:r>
+                        <m:t>c</m:t>
+                      </m:r>
+                    </m:e>
+                  </m:acc>
+                  <m:r>
+                    <m:rPr>
+                      <m:sty m:val="p"/>
+                    </m:rPr>
+                    <m:t>=</m:t>
+                  </m:r>
+                  <m:r>
+                    <m:t>0</m:t>
+                  </m:r>
+                </m:sup>
+              </m:sSubSup>
+              <m:r>
+                <m:rPr>
+                  <m:sty m:val="p"/>
+                </m:rPr>
+                <m:t>=</m:t>
+              </m:r>
+              <m:r>
+                <m:t>0</m:t>
+              </m:r>
+              <m:r>
+                <m:rPr>
+                  <m:sty m:val="p"/>
+                </m:rPr>
+                <m:t>,</m:t>
+              </m:r>
+              <m:sSub>
+                <m:e>
+                  <m:r>
+                    <m:t>C</m:t>
+                  </m:r>
+                </m:e>
+                <m:sub>
+                  <m:r>
+                    <m:t>m</m:t>
+                  </m:r>
+                </m:sub>
+              </m:sSub>
+              <m:r>
+                <m:rPr>
+                  <m:sty m:val="p"/>
+                </m:rPr>
+                <m:t>=</m:t>
+              </m:r>
+              <m:r>
+                <m:t>0</m:t>
+              </m:r>
+              <m:r>
+                <m:rPr>
+                  <m:sty m:val="p"/>
+                </m:rPr>
+                <m:t>,</m:t>
+              </m:r>
+              <m:r>
+                <m:t>A</m:t>
+              </m:r>
+              <m:r>
+                <m:rPr>
+                  <m:sty m:val="p"/>
+                </m:rPr>
+                <m:t>=</m:t>
+              </m:r>
+              <m:r>
+                <m:t>a</m:t>
+              </m:r>
+              <m:r>
+                <m:rPr>
+                  <m:sty m:val="p"/>
+                </m:rPr>
+                <m:t>]</m:t>
+              </m:r>
+            </m:oMath>
+            <w:r>
+              <w:t xml:space="preserve">.</w:t>
+            </w:r>
+            <w:r>
+              <w:t xml:space="preserve"> </w:t>
+            </w:r>
+            <w:r>
+              <w:t xml:space="preserve">Among people with</w:t>
+            </w:r>
+            <w:r>
+              <w:t xml:space="preserve"> </w:t>
+            </w:r>
+            <m:oMath>
+              <m:sSub>
+                <m:e>
+                  <m:r>
+                    <m:t>C</m:t>
+                  </m:r>
+                </m:e>
+                <m:sub>
+                  <m:r>
+                    <m:t>m</m:t>
+                  </m:r>
+                </m:sub>
+              </m:sSub>
+              <m:r>
+                <m:rPr>
+                  <m:sty m:val="p"/>
+                </m:rPr>
+                <m:t>=</m:t>
+              </m:r>
+              <m:r>
+                <m:t>0</m:t>
+              </m:r>
+            </m:oMath>
+            <w:r>
+              <w:t xml:space="preserve">, consistency replaces</w:t>
+            </w:r>
+            <w:r>
+              <w:t xml:space="preserve"> </w:t>
+            </w:r>
+            <m:oMath>
+              <m:sSubSup>
+                <m:e>
+                  <m:r>
+                    <m:t>D</m:t>
+                  </m:r>
+                </m:e>
+                <m:sub>
+                  <m:r>
+                    <m:t>m</m:t>
+                  </m:r>
+                </m:sub>
+                <m:sup>
+                  <m:acc>
+                    <m:accPr>
+                      <m:chr m:val="‾"/>
+                    </m:accPr>
+                    <m:e>
+                      <m:r>
+                        <m:t>c</m:t>
+                      </m:r>
+                    </m:e>
+                  </m:acc>
+                  <m:r>
+                    <m:rPr>
+                      <m:sty m:val="p"/>
+                    </m:rPr>
+                    <m:t>=</m:t>
+                  </m:r>
+                  <m:r>
+                    <m:t>0</m:t>
+                  </m:r>
+                </m:sup>
+              </m:sSubSup>
+            </m:oMath>
+            <w:r>
+              <w:t xml:space="preserve"> </w:t>
+            </w:r>
+            <w:r>
+              <w:t xml:space="preserve">by</w:t>
+            </w:r>
+            <w:r>
+              <w:t xml:space="preserve"> </w:t>
+            </w:r>
+            <m:oMath>
+              <m:sSub>
+                <m:e>
+                  <m:r>
+                    <m:t>D</m:t>
+                  </m:r>
+                </m:e>
+                <m:sub>
+                  <m:r>
+                    <m:t>m</m:t>
+                  </m:r>
+                </m:sub>
+              </m:sSub>
+            </m:oMath>
+            <w:r>
+              <w:t xml:space="preserve"> </w:t>
+            </w:r>
+            <w:r>
+              <w:t xml:space="preserve">and</w:t>
+            </w:r>
+            <w:r>
+              <w:t xml:space="preserve"> </w:t>
+            </w:r>
+            <m:oMath>
+              <m:sSubSup>
+                <m:e>
+                  <m:r>
+                    <m:t>D</m:t>
+                  </m:r>
+                </m:e>
+                <m:sub>
+                  <m:r>
+                    <m:t>m</m:t>
+                  </m:r>
+                  <m:r>
+                    <m:rPr>
+                      <m:sty m:val="p"/>
+                    </m:rPr>
+                    <m:t>−</m:t>
+                  </m:r>
+                  <m:r>
+                    <m:t>1</m:t>
+                  </m:r>
+                </m:sub>
+                <m:sup>
+                  <m:acc>
+                    <m:accPr>
+                      <m:chr m:val="‾"/>
+                    </m:accPr>
+                    <m:e>
+                      <m:r>
+                        <m:t>c</m:t>
+                      </m:r>
+                    </m:e>
+                  </m:acc>
+                  <m:r>
+                    <m:rPr>
+                      <m:sty m:val="p"/>
+                    </m:rPr>
+                    <m:t>=</m:t>
+                  </m:r>
+                  <m:r>
+                    <m:t>0</m:t>
+                  </m:r>
+                </m:sup>
+              </m:sSubSup>
+            </m:oMath>
+            <w:r>
+              <w:t xml:space="preserve"> </w:t>
+            </w:r>
+            <w:r>
+              <w:t xml:space="preserve">by</w:t>
+            </w:r>
+            <w:r>
+              <w:t xml:space="preserve"> </w:t>
+            </w:r>
+            <m:oMath>
+              <m:sSub>
+                <m:e>
+                  <m:r>
+                    <m:t>D</m:t>
+                  </m:r>
+                </m:e>
+                <m:sub>
+                  <m:r>
+                    <m:t>m</m:t>
+                  </m:r>
+                  <m:r>
+                    <m:rPr>
+                      <m:sty m:val="p"/>
+                    </m:rPr>
+                    <m:t>−</m:t>
+                  </m:r>
+                  <m:r>
+                    <m:t>1</m:t>
+                  </m:r>
+                </m:sub>
+              </m:sSub>
+            </m:oMath>
+            <w:r>
+              <w:t xml:space="preserve">,</w:t>
+            </w:r>
+            <w:r>
+              <w:t xml:space="preserve"> </w:t>
+            </w:r>
+            <w:r>
+              <w:t xml:space="preserve">so the factor equals</w:t>
+            </w:r>
+            <w:r>
+              <w:t xml:space="preserve"> </w:t>
+            </w:r>
+            <m:oMath>
+              <m:r>
+                <m:rPr>
+                  <m:sty m:val="p"/>
+                </m:rPr>
+                <m:t>Pr</m:t>
+              </m:r>
+              <m:r>
+                <m:rPr>
+                  <m:sty m:val="p"/>
+                </m:rPr>
+                <m:t>[</m:t>
+              </m:r>
+              <m:sSub>
+                <m:e>
+                  <m:r>
+                    <m:t>D</m:t>
+                  </m:r>
+                </m:e>
+                <m:sub>
+                  <m:r>
+                    <m:t>m</m:t>
+                  </m:r>
+                </m:sub>
+              </m:sSub>
+              <m:r>
+                <m:rPr>
+                  <m:sty m:val="p"/>
+                </m:rPr>
+                <m:t>=</m:t>
+              </m:r>
+              <m:r>
+                <m:t>0</m:t>
+              </m:r>
+              <m:r>
+                <m:rPr>
+                  <m:sty m:val="p"/>
+                </m:rPr>
+                <m:t>∣</m:t>
+              </m:r>
+              <m:sSub>
+                <m:e>
+                  <m:r>
+                    <m:t>D</m:t>
+                  </m:r>
+                </m:e>
+                <m:sub>
+                  <m:r>
+                    <m:t>m</m:t>
+                  </m:r>
+                  <m:r>
+                    <m:rPr>
+                      <m:sty m:val="p"/>
+                    </m:rPr>
+                    <m:t>−</m:t>
+                  </m:r>
+                  <m:r>
+                    <m:t>1</m:t>
+                  </m:r>
+                </m:sub>
+              </m:sSub>
+              <m:r>
+                <m:rPr>
+                  <m:sty m:val="p"/>
+                </m:rPr>
+                <m:t>=</m:t>
+              </m:r>
+              <m:r>
+                <m:t>0</m:t>
+              </m:r>
+              <m:r>
+                <m:rPr>
+                  <m:sty m:val="p"/>
+                </m:rPr>
+                <m:t>,</m:t>
+              </m:r>
+              <m:sSub>
+                <m:e>
+                  <m:r>
+                    <m:t>C</m:t>
+                  </m:r>
+                </m:e>
+                <m:sub>
+                  <m:r>
+                    <m:t>m</m:t>
+                  </m:r>
+                </m:sub>
+              </m:sSub>
+              <m:r>
+                <m:rPr>
+                  <m:sty m:val="p"/>
+                </m:rPr>
+                <m:t>=</m:t>
+              </m:r>
+              <m:r>
+                <m:t>0</m:t>
+              </m:r>
+              <m:r>
+                <m:rPr>
+                  <m:sty m:val="p"/>
+                </m:rPr>
+                <m:t>,</m:t>
+              </m:r>
+              <m:r>
+                <m:t>A</m:t>
+              </m:r>
+              <m:r>
+                <m:rPr>
+                  <m:sty m:val="p"/>
+                </m:rPr>
+                <m:t>=</m:t>
+              </m:r>
+              <m:r>
+                <m:t>a</m:t>
+              </m:r>
+              <m:r>
+                <m:rPr>
+                  <m:sty m:val="p"/>
+                </m:rPr>
+                <m:t>]</m:t>
+              </m:r>
+            </m:oMath>
+            <w:r>
+              <w:t xml:space="preserve">,</w:t>
+            </w:r>
+            <w:r>
+              <w:t xml:space="preserve"> </w:t>
+            </w:r>
+            <w:r>
+              <w:t xml:space="preserve">which involves only observed data.</w:t>
+            </w:r>
+            <w:r>
+              <w:t xml:space="preserve"> </w:t>
+            </w:r>
+            <w:r>
+              <w:t xml:space="preserve">Multiplying the</w:t>
+            </w:r>
+            <w:r>
+              <w:t xml:space="preserve"> </w:t>
+            </w:r>
+            <m:oMath>
+              <m:r>
+                <m:t>k</m:t>
+              </m:r>
+            </m:oMath>
+            <w:r>
+              <w:t xml:space="preserve"> </w:t>
+            </w:r>
+            <w:r>
+              <w:t xml:space="preserve">factors gives the result.</w:t>
+            </w:r>
+          </w:p>
+          <w:p/>
+        </w:tc>
+      </w:tr>
+    </w:tbl>
+    <w:p>
+      <w:pPr>
+        <w:pStyle w:val="BodyText"/>
+      </w:pPr>
+      <w:ins w:id="46" w:author="PR Preview" w:date="2024-01-01T00:00:00Z">
+        <w:r>
+          <w:t xml:space="preserve">The range</w:t>
+        </w:r>
+      </w:ins>
+      <w:ins w:id="46" w:author="PR Preview" w:date="2024-01-01T00:00:00Z">
+        <w:r>
+          <w:t xml:space="preserve"> </w:t>
+        </w:r>
+      </w:ins>
+      <m:oMath>
+        <m:r>
+          <m:t>k</m:t>
+        </m:r>
+        <m:r>
+          <m:rPr>
+            <m:sty m:val="p"/>
+          </m:rPr>
+          <m:t>=</m:t>
+        </m:r>
+        <m:r>
+          <m:t>1</m:t>
+        </m:r>
+        <m:r>
+          <m:rPr>
+            <m:sty m:val="p"/>
+          </m:rPr>
+          <m:t>,</m:t>
+        </m:r>
+        <m:r>
+          <m:rPr>
+            <m:sty m:val="p"/>
+          </m:rPr>
+          <m:t>…</m:t>
+        </m:r>
+        <m:r>
+          <m:rPr>
+            <m:sty m:val="p"/>
+          </m:rPr>
+          <m:t>,</m:t>
+        </m:r>
+        <m:sSub>
+          <m:e>
+            <m:r>
+              <m:t>k</m:t>
+            </m:r>
+          </m:e>
+          <m:sub>
+            <m:r>
+              <m:rPr>
+                <m:nor/>
+                <m:sty m:val="p"/>
+              </m:rPr>
+              <m:t>end</m:t>
+            </m:r>
+          </m:sub>
+        </m:sSub>
+      </m:oMath>
+      <w:ins w:id="46" w:author="PR Preview" w:date="2024-01-01T00:00:00Z">
+        <w:r>
+          <w:t xml:space="preserve"> </w:t>
+        </w:r>
+      </w:ins>
+      <w:ins w:id="46" w:author="PR Preview" w:date="2024-01-01T00:00:00Z">
+        <w:r>
+          <w:t xml:space="preserve">in</w:t>
+        </w:r>
+      </w:ins>
+      <w:ins w:id="46" w:author="PR Preview" w:date="2024-01-01T00:00:00Z">
+        <w:r>
+          <w:t xml:space="preserve"> </w:t>
+        </w:r>
+      </w:ins>
+      <w:hyperlink w:anchor="prp-survival-random-censoring">
+        <w:r>
+          <w:rPr>
+            <w:rStyle w:val="Hyperlink"/>
+          </w:rPr>
+          <w:t xml:space="preserve">Proposition 2</w:t>
+        </w:r>
+      </w:hyperlink>
+      <w:ins w:id="46" w:author="PR Preview" w:date="2024-01-01T00:00:00Z">
+        <w:r>
+          <w:t xml:space="preserve"> </w:t>
+        </w:r>
+      </w:ins>
+      <w:ins w:id="46" w:author="PR Preview" w:date="2024-01-01T00:00:00Z">
+        <w:r>
+          <w:t xml:space="preserve">covers the same times as</w:t>
+        </w:r>
+      </w:ins>
+      <w:ins w:id="46" w:author="PR Preview" w:date="2024-01-01T00:00:00Z">
+        <w:r>
+          <w:t xml:space="preserve"> </w:t>
+        </w:r>
+      </w:ins>
+      <m:oMath>
+        <m:sSub>
+          <m:e>
+            <m:r>
+              <m:t>D</m:t>
+            </m:r>
+          </m:e>
+          <m:sub>
+            <m:r>
+              <m:t>k</m:t>
+            </m:r>
+            <m:r>
+              <m:rPr>
+                <m:sty m:val="p"/>
+              </m:rPr>
+              <m:t>+</m:t>
+            </m:r>
+            <m:r>
+              <m:t>1</m:t>
+            </m:r>
+          </m:sub>
+        </m:sSub>
+      </m:oMath>
+      <w:ins w:id="46" w:author="PR Preview" w:date="2024-01-01T00:00:00Z">
+        <w:r>
+          <w:t xml:space="preserve"> </w:t>
+        </w:r>
+      </w:ins>
+      <w:ins w:id="46" w:author="PR Preview" w:date="2024-01-01T00:00:00Z">
+        <w:r>
+          <w:t xml:space="preserve">for</w:t>
+        </w:r>
+      </w:ins>
+      <w:ins w:id="46" w:author="PR Preview" w:date="2024-01-01T00:00:00Z">
+        <w:r>
+          <w:t xml:space="preserve"> </w:t>
+        </w:r>
+      </w:ins>
+      <m:oMath>
+        <m:r>
+          <m:t>k</m:t>
+        </m:r>
+        <m:r>
+          <m:rPr>
+            <m:sty m:val="p"/>
+          </m:rPr>
+          <m:t>=</m:t>
+        </m:r>
+        <m:r>
+          <m:t>0</m:t>
+        </m:r>
+        <m:r>
+          <m:rPr>
+            <m:sty m:val="p"/>
+          </m:rPr>
+          <m:t>,</m:t>
+        </m:r>
+        <m:r>
+          <m:rPr>
+            <m:sty m:val="p"/>
+          </m:rPr>
+          <m:t>…</m:t>
+        </m:r>
+        <m:r>
+          <m:rPr>
+            <m:sty m:val="p"/>
+          </m:rPr>
+          <m:t>,</m:t>
+        </m:r>
+        <m:sSub>
+          <m:e>
+            <m:r>
+              <m:t>k</m:t>
+            </m:r>
+          </m:e>
+          <m:sub>
+            <m:r>
+              <m:rPr>
+                <m:nor/>
+                <m:sty m:val="p"/>
+              </m:rPr>
+              <m:t>end</m:t>
+            </m:r>
+          </m:sub>
+        </m:sSub>
+        <m:r>
+          <m:rPr>
+            <m:sty m:val="p"/>
+          </m:rPr>
+          <m:t>−</m:t>
+        </m:r>
+        <m:r>
+          <m:t>1</m:t>
+        </m:r>
+      </m:oMath>
+      <w:ins w:id="46" w:author="PR Preview" w:date="2024-01-01T00:00:00Z">
+        <w:r>
+          <w:t xml:space="preserve"> </w:t>
+        </w:r>
+      </w:ins>
+      <w:ins w:id="46" w:author="PR Preview" w:date="2024-01-01T00:00:00Z">
+        <w:r>
+          <w:t xml:space="preserve">elsewhere in this chapter.</w:t>
         </w:r>
       </w:ins>
     </w:p>
@@ -12682,27 +15066,27 @@
       <w:pPr>
         <w:pStyle w:val="BodyText"/>
       </w:pPr>
-      <w:ins w:id="45" w:author="PR Preview" w:date="2024-01-01T00:00:00Z">
+      <w:ins w:id="47" w:author="PR Preview" w:date="2024-01-01T00:00:00Z">
         <w:r>
           <w:t xml:space="preserve">Estimation proceeds as before,</w:t>
         </w:r>
       </w:ins>
-      <w:ins w:id="45" w:author="PR Preview" w:date="2024-01-01T00:00:00Z">
+      <w:ins w:id="47" w:author="PR Preview" w:date="2024-01-01T00:00:00Z">
         <w:r>
           <w:t xml:space="preserve"> </w:t>
         </w:r>
       </w:ins>
-      <w:ins w:id="45" w:author="PR Preview" w:date="2024-01-01T00:00:00Z">
+      <w:ins w:id="47" w:author="PR Preview" w:date="2024-01-01T00:00:00Z">
         <w:r>
           <w:t xml:space="preserve">except that the quantity estimated nonparametrically or with a logistic model</w:t>
         </w:r>
       </w:ins>
-      <w:ins w:id="45" w:author="PR Preview" w:date="2024-01-01T00:00:00Z">
+      <w:ins w:id="47" w:author="PR Preview" w:date="2024-01-01T00:00:00Z">
         <w:r>
           <w:t xml:space="preserve"> </w:t>
         </w:r>
       </w:ins>
-      <w:ins w:id="45" w:author="PR Preview" w:date="2024-01-01T00:00:00Z">
+      <w:ins w:id="47" w:author="PR Preview" w:date="2024-01-01T00:00:00Z">
         <w:r>
           <w:t xml:space="preserve">is the cause-specific hazard (</w:t>
         </w:r>
@@ -12715,7 +15099,7 @@
           <w:t xml:space="preserve">Definition 10</w:t>
         </w:r>
       </w:hyperlink>
-      <w:ins w:id="45" w:author="PR Preview" w:date="2024-01-01T00:00:00Z">
+      <w:ins w:id="47" w:author="PR Preview" w:date="2024-01-01T00:00:00Z">
         <w:r>
           <w:t xml:space="preserve">).</w:t>
         </w:r>
@@ -12871,17 +15255,17 @@
       <w:pPr>
         <w:pStyle w:val="BodyText"/>
       </w:pPr>
-      <w:ins w:id="46" w:author="PR Preview" w:date="2024-01-01T00:00:00Z">
+      <w:ins w:id="48" w:author="PR Preview" w:date="2024-01-01T00:00:00Z">
         <w:r>
           <w:t xml:space="preserve">The rest of the chapter adds adjustment for baseline confounders with g-methods,</w:t>
         </w:r>
       </w:ins>
-      <w:ins w:id="46" w:author="PR Preview" w:date="2024-01-01T00:00:00Z">
+      <w:ins w:id="48" w:author="PR Preview" w:date="2024-01-01T00:00:00Z">
         <w:r>
           <w:t xml:space="preserve"> </w:t>
         </w:r>
       </w:ins>
-      <w:ins w:id="46" w:author="PR Preview" w:date="2024-01-01T00:00:00Z">
+      <w:ins w:id="48" w:author="PR Preview" w:date="2024-01-01T00:00:00Z">
         <w:r>
           <w:t xml:space="preserve">and Part III extends it to treatments and confounders that vary over time.</w:t>
         </w:r>
@@ -13843,7 +16227,7 @@
       <w:pPr>
         <w:pStyle w:val="BodyText"/>
       </w:pPr>
-      <w:ins w:id="53" w:author="PR Preview" w:date="2024-01-01T00:00:00Z">
+      <w:ins w:id="55" w:author="PR Preview" w:date="2024-01-01T00:00:00Z">
         <w:r>
           <w:rPr>
             <w:b/>
@@ -13852,12 +16236,12 @@
           <w:t xml:space="preserve">Algorithm 1 (IP weighted survival curves)</w:t>
         </w:r>
       </w:ins>
-      <w:ins w:id="53" w:author="PR Preview" w:date="2024-01-01T00:00:00Z">
+      <w:ins w:id="55" w:author="PR Preview" w:date="2024-01-01T00:00:00Z">
         <w:r>
           <w:t xml:space="preserve"> </w:t>
         </w:r>
       </w:ins>
-      <w:ins w:id="53" w:author="PR Preview" w:date="2024-01-01T00:00:00Z">
+      <w:ins w:id="55" w:author="PR Preview" w:date="2024-01-01T00:00:00Z">
         <w:r>
           <w:rPr>
             <w:b/>
@@ -13866,12 +16250,12 @@
           <w:t xml:space="preserve">Step 1</w:t>
         </w:r>
       </w:ins>
-      <w:ins w:id="53" w:author="PR Preview" w:date="2024-01-01T00:00:00Z">
+      <w:ins w:id="55" w:author="PR Preview" w:date="2024-01-01T00:00:00Z">
         <w:r>
           <w:t xml:space="preserve">: Estimate each person’s stabilized IP weight</w:t>
         </w:r>
       </w:ins>
-      <w:ins w:id="53" w:author="PR Preview" w:date="2024-01-01T00:00:00Z">
+      <w:ins w:id="55" w:author="PR Preview" w:date="2024-01-01T00:00:00Z">
         <w:r>
           <w:t xml:space="preserve"> </w:t>
         </w:r>
@@ -13893,27 +16277,27 @@
           </m:sup>
         </m:sSup>
       </m:oMath>
-      <w:ins w:id="53" w:author="PR Preview" w:date="2024-01-01T00:00:00Z">
+      <w:ins w:id="55" w:author="PR Preview" w:date="2024-01-01T00:00:00Z">
         <w:r>
           <w:t xml:space="preserve"> </w:t>
         </w:r>
       </w:ins>
-      <w:ins w:id="53" w:author="PR Preview" w:date="2024-01-01T00:00:00Z">
+      <w:ins w:id="55" w:author="PR Preview" w:date="2024-01-01T00:00:00Z">
         <w:r>
           <w:t xml:space="preserve">as in Chapter 12.</w:t>
         </w:r>
       </w:ins>
-      <w:ins w:id="53" w:author="PR Preview" w:date="2024-01-01T00:00:00Z">
+      <w:ins w:id="55" w:author="PR Preview" w:date="2024-01-01T00:00:00Z">
         <w:r>
           <w:t xml:space="preserve"> </w:t>
         </w:r>
       </w:ins>
-      <w:ins w:id="53" w:author="PR Preview" w:date="2024-01-01T00:00:00Z">
+      <w:ins w:id="55" w:author="PR Preview" w:date="2024-01-01T00:00:00Z">
         <w:r>
           <w:t xml:space="preserve">Fit a logistic model for</w:t>
         </w:r>
       </w:ins>
-      <w:ins w:id="53" w:author="PR Preview" w:date="2024-01-01T00:00:00Z">
+      <w:ins w:id="55" w:author="PR Preview" w:date="2024-01-01T00:00:00Z">
         <w:r>
           <w:t xml:space="preserve"> </w:t>
         </w:r>
@@ -13959,22 +16343,22 @@
           <m:t>]</m:t>
         </m:r>
       </m:oMath>
-      <w:ins w:id="53" w:author="PR Preview" w:date="2024-01-01T00:00:00Z">
+      <w:ins w:id="55" w:author="PR Preview" w:date="2024-01-01T00:00:00Z">
         <w:r>
           <w:t xml:space="preserve">.</w:t>
         </w:r>
       </w:ins>
-      <w:ins w:id="53" w:author="PR Preview" w:date="2024-01-01T00:00:00Z">
+      <w:ins w:id="55" w:author="PR Preview" w:date="2024-01-01T00:00:00Z">
         <w:r>
           <w:t xml:space="preserve"> </w:t>
         </w:r>
       </w:ins>
-      <w:ins w:id="53" w:author="PR Preview" w:date="2024-01-01T00:00:00Z">
+      <w:ins w:id="55" w:author="PR Preview" w:date="2024-01-01T00:00:00Z">
         <w:r>
           <w:t xml:space="preserve">The denominator is the fitted</w:t>
         </w:r>
       </w:ins>
-      <w:ins w:id="53" w:author="PR Preview" w:date="2024-01-01T00:00:00Z">
+      <w:ins w:id="55" w:author="PR Preview" w:date="2024-01-01T00:00:00Z">
         <w:r>
           <w:t xml:space="preserve"> </w:t>
         </w:r>
@@ -14027,27 +16411,27 @@
           <m:t>]</m:t>
         </m:r>
       </m:oMath>
-      <w:ins w:id="53" w:author="PR Preview" w:date="2024-01-01T00:00:00Z">
+      <w:ins w:id="55" w:author="PR Preview" w:date="2024-01-01T00:00:00Z">
         <w:r>
           <w:t xml:space="preserve"> </w:t>
         </w:r>
       </w:ins>
-      <w:ins w:id="53" w:author="PR Preview" w:date="2024-01-01T00:00:00Z">
+      <w:ins w:id="55" w:author="PR Preview" w:date="2024-01-01T00:00:00Z">
         <w:r>
           <w:t xml:space="preserve">for the treated</w:t>
         </w:r>
       </w:ins>
-      <w:ins w:id="53" w:author="PR Preview" w:date="2024-01-01T00:00:00Z">
+      <w:ins w:id="55" w:author="PR Preview" w:date="2024-01-01T00:00:00Z">
         <w:r>
           <w:t xml:space="preserve"> </w:t>
         </w:r>
       </w:ins>
-      <w:ins w:id="53" w:author="PR Preview" w:date="2024-01-01T00:00:00Z">
+      <w:ins w:id="55" w:author="PR Preview" w:date="2024-01-01T00:00:00Z">
         <w:r>
           <w:t xml:space="preserve">and</w:t>
         </w:r>
       </w:ins>
-      <w:ins w:id="53" w:author="PR Preview" w:date="2024-01-01T00:00:00Z">
+      <w:ins w:id="55" w:author="PR Preview" w:date="2024-01-01T00:00:00Z">
         <w:r>
           <w:t xml:space="preserve"> </w:t>
         </w:r>
@@ -14109,27 +16493,27 @@
           <m:t>]</m:t>
         </m:r>
       </m:oMath>
-      <w:ins w:id="53" w:author="PR Preview" w:date="2024-01-01T00:00:00Z">
+      <w:ins w:id="55" w:author="PR Preview" w:date="2024-01-01T00:00:00Z">
         <w:r>
           <w:t xml:space="preserve"> </w:t>
         </w:r>
       </w:ins>
-      <w:ins w:id="53" w:author="PR Preview" w:date="2024-01-01T00:00:00Z">
+      <w:ins w:id="55" w:author="PR Preview" w:date="2024-01-01T00:00:00Z">
         <w:r>
           <w:t xml:space="preserve">for the untreated;</w:t>
         </w:r>
       </w:ins>
-      <w:ins w:id="53" w:author="PR Preview" w:date="2024-01-01T00:00:00Z">
+      <w:ins w:id="55" w:author="PR Preview" w:date="2024-01-01T00:00:00Z">
         <w:r>
           <w:t xml:space="preserve"> </w:t>
         </w:r>
       </w:ins>
-      <w:ins w:id="53" w:author="PR Preview" w:date="2024-01-01T00:00:00Z">
+      <w:ins w:id="55" w:author="PR Preview" w:date="2024-01-01T00:00:00Z">
         <w:r>
           <w:t xml:space="preserve">the numerator is</w:t>
         </w:r>
       </w:ins>
-      <w:ins w:id="53" w:author="PR Preview" w:date="2024-01-01T00:00:00Z">
+      <w:ins w:id="55" w:author="PR Preview" w:date="2024-01-01T00:00:00Z">
         <w:r>
           <w:t xml:space="preserve"> </w:t>
         </w:r>
@@ -14173,17 +16557,17 @@
           <m:t>]</m:t>
         </m:r>
       </m:oMath>
-      <w:ins w:id="53" w:author="PR Preview" w:date="2024-01-01T00:00:00Z">
+      <w:ins w:id="55" w:author="PR Preview" w:date="2024-01-01T00:00:00Z">
         <w:r>
           <w:t xml:space="preserve"> </w:t>
         </w:r>
       </w:ins>
-      <w:ins w:id="53" w:author="PR Preview" w:date="2024-01-01T00:00:00Z">
+      <w:ins w:id="55" w:author="PR Preview" w:date="2024-01-01T00:00:00Z">
         <w:r>
           <w:t xml:space="preserve">for the treated and</w:t>
         </w:r>
       </w:ins>
-      <w:ins w:id="53" w:author="PR Preview" w:date="2024-01-01T00:00:00Z">
+      <w:ins w:id="55" w:author="PR Preview" w:date="2024-01-01T00:00:00Z">
         <w:r>
           <w:t xml:space="preserve"> </w:t>
         </w:r>
@@ -14236,27 +16620,27 @@
           <m:t>]</m:t>
         </m:r>
       </m:oMath>
-      <w:ins w:id="53" w:author="PR Preview" w:date="2024-01-01T00:00:00Z">
+      <w:ins w:id="55" w:author="PR Preview" w:date="2024-01-01T00:00:00Z">
         <w:r>
           <w:t xml:space="preserve"> </w:t>
         </w:r>
       </w:ins>
-      <w:ins w:id="53" w:author="PR Preview" w:date="2024-01-01T00:00:00Z">
+      <w:ins w:id="55" w:author="PR Preview" w:date="2024-01-01T00:00:00Z">
         <w:r>
           <w:t xml:space="preserve">for the untreated,</w:t>
         </w:r>
       </w:ins>
-      <w:ins w:id="53" w:author="PR Preview" w:date="2024-01-01T00:00:00Z">
+      <w:ins w:id="55" w:author="PR Preview" w:date="2024-01-01T00:00:00Z">
         <w:r>
           <w:t xml:space="preserve"> </w:t>
         </w:r>
       </w:ins>
-      <w:ins w:id="53" w:author="PR Preview" w:date="2024-01-01T00:00:00Z">
+      <w:ins w:id="55" w:author="PR Preview" w:date="2024-01-01T00:00:00Z">
         <w:r>
           <w:t xml:space="preserve">with</w:t>
         </w:r>
       </w:ins>
-      <w:ins w:id="53" w:author="PR Preview" w:date="2024-01-01T00:00:00Z">
+      <w:ins w:id="55" w:author="PR Preview" w:date="2024-01-01T00:00:00Z">
         <w:r>
           <w:t xml:space="preserve"> </w:t>
         </w:r>
@@ -14300,27 +16684,27 @@
           <m:t>]</m:t>
         </m:r>
       </m:oMath>
-      <w:ins w:id="53" w:author="PR Preview" w:date="2024-01-01T00:00:00Z">
+      <w:ins w:id="55" w:author="PR Preview" w:date="2024-01-01T00:00:00Z">
         <w:r>
           <w:t xml:space="preserve"> </w:t>
         </w:r>
       </w:ins>
-      <w:ins w:id="53" w:author="PR Preview" w:date="2024-01-01T00:00:00Z">
+      <w:ins w:id="55" w:author="PR Preview" w:date="2024-01-01T00:00:00Z">
         <w:r>
           <w:t xml:space="preserve">estimated nonparametrically or by a logistic model without covariates.</w:t>
         </w:r>
       </w:ins>
-      <w:ins w:id="53" w:author="PR Preview" w:date="2024-01-01T00:00:00Z">
+      <w:ins w:id="55" w:author="PR Preview" w:date="2024-01-01T00:00:00Z">
         <w:r>
           <w:t xml:space="preserve"> </w:t>
         </w:r>
       </w:ins>
-      <w:ins w:id="53" w:author="PR Preview" w:date="2024-01-01T00:00:00Z">
+      <w:ins w:id="55" w:author="PR Preview" w:date="2024-01-01T00:00:00Z">
         <w:r>
           <w:t xml:space="preserve">In the weighted pseudo-population</w:t>
         </w:r>
       </w:ins>
-      <w:ins w:id="53" w:author="PR Preview" w:date="2024-01-01T00:00:00Z">
+      <w:ins w:id="55" w:author="PR Preview" w:date="2024-01-01T00:00:00Z">
         <w:r>
           <w:t xml:space="preserve"> </w:t>
         </w:r>
@@ -14330,17 +16714,17 @@
           <m:t>L</m:t>
         </m:r>
       </m:oMath>
-      <w:ins w:id="53" w:author="PR Preview" w:date="2024-01-01T00:00:00Z">
+      <w:ins w:id="55" w:author="PR Preview" w:date="2024-01-01T00:00:00Z">
         <w:r>
           <w:t xml:space="preserve"> </w:t>
         </w:r>
       </w:ins>
-      <w:ins w:id="53" w:author="PR Preview" w:date="2024-01-01T00:00:00Z">
+      <w:ins w:id="55" w:author="PR Preview" w:date="2024-01-01T00:00:00Z">
         <w:r>
           <w:t xml:space="preserve">and</w:t>
         </w:r>
       </w:ins>
-      <w:ins w:id="53" w:author="PR Preview" w:date="2024-01-01T00:00:00Z">
+      <w:ins w:id="55" w:author="PR Preview" w:date="2024-01-01T00:00:00Z">
         <w:r>
           <w:t xml:space="preserve"> </w:t>
         </w:r>
@@ -14350,17 +16734,17 @@
           <m:t>A</m:t>
         </m:r>
       </m:oMath>
-      <w:ins w:id="53" w:author="PR Preview" w:date="2024-01-01T00:00:00Z">
+      <w:ins w:id="55" w:author="PR Preview" w:date="2024-01-01T00:00:00Z">
         <w:r>
           <w:t xml:space="preserve"> </w:t>
         </w:r>
       </w:ins>
-      <w:ins w:id="53" w:author="PR Preview" w:date="2024-01-01T00:00:00Z">
+      <w:ins w:id="55" w:author="PR Preview" w:date="2024-01-01T00:00:00Z">
         <w:r>
           <w:t xml:space="preserve">are independent, so</w:t>
         </w:r>
       </w:ins>
-      <w:ins w:id="53" w:author="PR Preview" w:date="2024-01-01T00:00:00Z">
+      <w:ins w:id="55" w:author="PR Preview" w:date="2024-01-01T00:00:00Z">
         <w:r>
           <w:t xml:space="preserve"> </w:t>
         </w:r>
@@ -14370,24 +16754,14 @@
           <m:t>L</m:t>
         </m:r>
       </m:oMath>
-      <w:ins w:id="53" w:author="PR Preview" w:date="2024-01-01T00:00:00Z">
+      <w:ins w:id="55" w:author="PR Preview" w:date="2024-01-01T00:00:00Z">
         <w:r>
           <w:t xml:space="preserve"> </w:t>
         </w:r>
       </w:ins>
-      <w:ins w:id="53" w:author="PR Preview" w:date="2024-01-01T00:00:00Z">
+      <w:ins w:id="55" w:author="PR Preview" w:date="2024-01-01T00:00:00Z">
         <w:r>
           <w:t xml:space="preserve">no longer confounds.</w:t>
-        </w:r>
-      </w:ins>
-      <w:ins w:id="53" w:author="PR Preview" w:date="2024-01-01T00:00:00Z">
-        <w:r>
-          <w:t xml:space="preserve"> </w:t>
-        </w:r>
-      </w:ins>
-      <w:ins w:id="53" w:author="PR Preview" w:date="2024-01-01T00:00:00Z">
-        <w:r>
-          <w:t xml:space="preserve">The estimated weights averaged 1, as they should, and ranged from 0.33 to 4.21.</w:t>
         </w:r>
       </w:ins>
     </w:p>
@@ -15295,6 +17669,16 @@
       </w:r>
     </w:p>
     <w:bookmarkEnd w:id="58"/>
+    <w:p>
+      <w:pPr>
+        <w:pStyle w:val="BodyText"/>
+      </w:pPr>
+      <w:ins w:id="60" w:author="PR Preview" w:date="2024-01-01T00:00:00Z">
+        <w:r>
+          <w:t xml:space="preserve">In the NHEFS, the estimated weights averaged 1, as they should, and ranged from 0.33 to 4.21.</w:t>
+        </w:r>
+      </w:ins>
+    </w:p>
     <w:tbl>
       <w:tblPr>
         <w:tblStyle w:val="Table"/>
@@ -15620,7 +18004,7 @@
     </w:tbl>
     <w:bookmarkEnd w:id="62"/>
     <w:bookmarkEnd w:id="63"/>
-    <w:bookmarkStart w:id="72" w:name="the-parametric-g-formula-pp.-236-237"/>
+    <w:bookmarkStart w:id="73" w:name="the-parametric-g-formula-pp.-236-237"/>
     <w:p>
       <w:pPr>
         <w:pStyle w:val="Heading2"/>
@@ -15663,7 +18047,7 @@
         <w:t xml:space="preserve">.</w:t>
       </w:r>
     </w:p>
-    <w:bookmarkStart w:id="65" w:name="identification-via-standardization"/>
+    <w:bookmarkStart w:id="66" w:name="identification-via-standardization"/>
     <w:p>
       <w:pPr>
         <w:pStyle w:val="Heading3"/>
@@ -15676,12 +18060,12 @@
       <w:pPr>
         <w:pStyle w:val="FirstParagraph"/>
       </w:pPr>
-      <w:ins w:id="62" w:author="PR Preview" w:date="2024-01-01T00:00:00Z">
+      <w:ins w:id="65" w:author="PR Preview" w:date="2024-01-01T00:00:00Z">
         <w:r>
           <w:t xml:space="preserve">The counterfactual survival</w:t>
         </w:r>
       </w:ins>
-      <w:ins w:id="62" w:author="PR Preview" w:date="2024-01-01T00:00:00Z">
+      <w:ins w:id="65" w:author="PR Preview" w:date="2024-01-01T00:00:00Z">
         <w:r>
           <w:t xml:space="preserve"> </w:t>
         </w:r>
@@ -15741,17 +18125,17 @@
           <m:t>]</m:t>
         </m:r>
       </m:oMath>
-      <w:ins w:id="62" w:author="PR Preview" w:date="2024-01-01T00:00:00Z">
+      <w:ins w:id="65" w:author="PR Preview" w:date="2024-01-01T00:00:00Z">
         <w:r>
           <w:t xml:space="preserve"> </w:t>
         </w:r>
       </w:ins>
-      <w:ins w:id="62" w:author="PR Preview" w:date="2024-01-01T00:00:00Z">
+      <w:ins w:id="65" w:author="PR Preview" w:date="2024-01-01T00:00:00Z">
         <w:r>
           <w:t xml:space="preserve">is an average of the survivals at</w:t>
         </w:r>
       </w:ins>
-      <w:ins w:id="62" w:author="PR Preview" w:date="2024-01-01T00:00:00Z">
+      <w:ins w:id="65" w:author="PR Preview" w:date="2024-01-01T00:00:00Z">
         <w:r>
           <w:t xml:space="preserve"> </w:t>
         </w:r>
@@ -15770,17 +18154,17 @@
           <m:t>1</m:t>
         </m:r>
       </m:oMath>
-      <w:ins w:id="62" w:author="PR Preview" w:date="2024-01-01T00:00:00Z">
+      <w:ins w:id="65" w:author="PR Preview" w:date="2024-01-01T00:00:00Z">
         <w:r>
           <w:t xml:space="preserve"> </w:t>
         </w:r>
       </w:ins>
-      <w:ins w:id="62" w:author="PR Preview" w:date="2024-01-01T00:00:00Z">
+      <w:ins w:id="65" w:author="PR Preview" w:date="2024-01-01T00:00:00Z">
         <w:r>
           <w:t xml:space="preserve">conditional on</w:t>
         </w:r>
       </w:ins>
-      <w:ins w:id="62" w:author="PR Preview" w:date="2024-01-01T00:00:00Z">
+      <w:ins w:id="65" w:author="PR Preview" w:date="2024-01-01T00:00:00Z">
         <w:r>
           <w:t xml:space="preserve"> </w:t>
         </w:r>
@@ -15790,17 +18174,17 @@
           <m:t>L</m:t>
         </m:r>
       </m:oMath>
-      <w:ins w:id="62" w:author="PR Preview" w:date="2024-01-01T00:00:00Z">
+      <w:ins w:id="65" w:author="PR Preview" w:date="2024-01-01T00:00:00Z">
         <w:r>
           <w:t xml:space="preserve"> </w:t>
         </w:r>
       </w:ins>
-      <w:ins w:id="62" w:author="PR Preview" w:date="2024-01-01T00:00:00Z">
+      <w:ins w:id="65" w:author="PR Preview" w:date="2024-01-01T00:00:00Z">
         <w:r>
           <w:t xml:space="preserve">and on</w:t>
         </w:r>
       </w:ins>
-      <w:ins w:id="62" w:author="PR Preview" w:date="2024-01-01T00:00:00Z">
+      <w:ins w:id="65" w:author="PR Preview" w:date="2024-01-01T00:00:00Z">
         <w:r>
           <w:t xml:space="preserve"> </w:t>
         </w:r>
@@ -15819,22 +18203,22 @@
           <m:t>a</m:t>
         </m:r>
       </m:oMath>
-      <w:ins w:id="62" w:author="PR Preview" w:date="2024-01-01T00:00:00Z">
+      <w:ins w:id="65" w:author="PR Preview" w:date="2024-01-01T00:00:00Z">
         <w:r>
           <w:t xml:space="preserve">,</w:t>
         </w:r>
       </w:ins>
-      <w:ins w:id="62" w:author="PR Preview" w:date="2024-01-01T00:00:00Z">
+      <w:ins w:id="65" w:author="PR Preview" w:date="2024-01-01T00:00:00Z">
         <w:r>
           <w:t xml:space="preserve"> </w:t>
         </w:r>
       </w:ins>
-      <w:ins w:id="62" w:author="PR Preview" w:date="2024-01-01T00:00:00Z">
+      <w:ins w:id="65" w:author="PR Preview" w:date="2024-01-01T00:00:00Z">
         <w:r>
           <w:t xml:space="preserve">weighted by the distribution of</w:t>
         </w:r>
       </w:ins>
-      <w:ins w:id="62" w:author="PR Preview" w:date="2024-01-01T00:00:00Z">
+      <w:ins w:id="65" w:author="PR Preview" w:date="2024-01-01T00:00:00Z">
         <w:r>
           <w:t xml:space="preserve"> </w:t>
         </w:r>
@@ -15844,7 +18228,7 @@
           <m:t>L</m:t>
         </m:r>
       </m:oMath>
-      <w:ins w:id="62" w:author="PR Preview" w:date="2024-01-01T00:00:00Z">
+      <w:ins w:id="65" w:author="PR Preview" w:date="2024-01-01T00:00:00Z">
         <w:r>
           <w:t xml:space="preserve">.</w:t>
         </w:r>
@@ -16150,7 +18534,7 @@
       <w:pPr>
         <w:pStyle w:val="FirstParagraph"/>
       </w:pPr>
-      <w:ins w:id="63" w:author="PR Preview" w:date="2024-01-01T00:00:00Z">
+      <w:ins w:id="66" w:author="PR Preview" w:date="2024-01-01T00:00:00Z">
         <w:r>
           <w:t xml:space="preserve"> </w:t>
         </w:r>
@@ -16223,13 +18607,30 @@
               <w:t xml:space="preserve">. </w:t>
             </w:r>
             <w:r>
-              <w:t xml:space="preserve">For a formal proof, see Section 2.3.</w:t>
-            </w:r>
-            <w:r>
-              <w:t xml:space="preserve"> </w:t>
-            </w:r>
-            <w:r>
-              <w:t xml:space="preserve">In outline:</w:t>
+              <w:t xml:space="preserve">The argument is the one that identifies the</w:t>
+            </w:r>
+            <w:r>
+              <w:t xml:space="preserve"> </w:t>
+            </w:r>
+            <w:hyperlink r:id="rId65">
+              <w:r>
+                <w:rPr>
+                  <w:rStyle w:val="Hyperlink"/>
+                </w:rPr>
+                <w:t xml:space="preserve">standardization formula</w:t>
+              </w:r>
+            </w:hyperlink>
+            <w:r>
+              <w:t xml:space="preserve"> </w:t>
+            </w:r>
+            <w:r>
+              <w:t xml:space="preserve">in chapter 2, applied to survival.</w:t>
+            </w:r>
+            <w:r>
+              <w:t xml:space="preserve"> </w:t>
+            </w:r>
+            <w:r>
+              <w:t xml:space="preserve">Step by step:</w:t>
             </w:r>
           </w:p>
           <w:p>
@@ -16778,8 +19179,8 @@
         </w:tc>
       </w:tr>
     </w:tbl>
-    <w:bookmarkEnd w:id="65"/>
-    <w:bookmarkStart w:id="71" w:name="estimation"/>
+    <w:bookmarkEnd w:id="66"/>
+    <w:bookmarkStart w:id="72" w:name="estimation"/>
     <w:p>
       <w:pPr>
         <w:pStyle w:val="Heading3"/>
@@ -16788,12 +19189,12 @@
         <w:t xml:space="preserve">5.2 Estimation</w:t>
       </w:r>
     </w:p>
-    <w:bookmarkStart w:id="66" w:name="alg-gformula-survival"/>
+    <w:bookmarkStart w:id="67" w:name="alg-gformula-survival"/>
     <w:p>
       <w:pPr>
         <w:pStyle w:val="FirstParagraph"/>
       </w:pPr>
-      <w:ins w:id="65" w:author="PR Preview" w:date="2024-01-01T00:00:00Z">
+      <w:ins w:id="68" w:author="PR Preview" w:date="2024-01-01T00:00:00Z">
         <w:r>
           <w:rPr>
             <w:b/>
@@ -16802,12 +19203,12 @@
           <w:t xml:space="preserve">Algorithm 2 (Parametric g-formula for survival curves)</w:t>
         </w:r>
       </w:ins>
-      <w:ins w:id="65" w:author="PR Preview" w:date="2024-01-01T00:00:00Z">
+      <w:ins w:id="68" w:author="PR Preview" w:date="2024-01-01T00:00:00Z">
         <w:r>
           <w:t xml:space="preserve"> </w:t>
         </w:r>
       </w:ins>
-      <w:ins w:id="65" w:author="PR Preview" w:date="2024-01-01T00:00:00Z">
+      <w:ins w:id="68" w:author="PR Preview" w:date="2024-01-01T00:00:00Z">
         <w:r>
           <w:t xml:space="preserve">Estimation again takes two steps.</w:t>
         </w:r>
@@ -17911,7 +20312,7 @@
         <w:t xml:space="preserve">The book’s Figure 17.7 shows the resulting curves.</w:t>
       </w:r>
     </w:p>
-    <w:bookmarkEnd w:id="66"/>
+    <w:bookmarkEnd w:id="67"/>
     <w:p>
       <w:pPr>
         <w:pStyle w:val="BodyText"/>
@@ -17968,7 +20369,7 @@
               <w:spacing w:before="16" w:after="64"/>
             </w:pPr>
           </w:p>
-          <w:bookmarkStart w:id="67" w:name="exm-nhefs-gformula-survival"/>
+          <w:bookmarkStart w:id="68" w:name="exm-nhefs-gformula-survival"/>
           <w:p>
             <w:pPr>
               <w:pStyle w:val="BodyText"/>
@@ -18196,7 +20597,7 @@
               <w:t xml:space="preserve">yields little evidence of an effect of quitting on mortality during follow-up.</w:t>
             </w:r>
           </w:p>
-          <w:bookmarkEnd w:id="67"/>
+          <w:bookmarkEnd w:id="68"/>
         </w:tc>
       </w:tr>
     </w:tbl>
@@ -18241,18 +20642,18 @@
                 <wp:inline>
                   <wp:extent cx="152400" cy="152400"/>
                   <wp:effectExtent b="0" l="0" r="0" t="0"/>
-                  <wp:docPr descr="" title="" id="69" name="Picture"/>
+                  <wp:docPr descr="" title="" id="70" name="Picture"/>
                   <a:graphic>
                     <a:graphicData uri="http://schemas.openxmlformats.org/drawingml/2006/picture">
                       <pic:pic>
                         <pic:nvPicPr>
-                          <pic:cNvPr descr="/opt/quarto/share/formats/docx/tip.png" id="70" name="Picture"/>
+                          <pic:cNvPr descr="/opt/quarto/share/formats/docx/tip.png" id="71" name="Picture"/>
                           <pic:cNvPicPr>
                             <a:picLocks noChangeArrowheads="1" noChangeAspect="1"/>
                           </pic:cNvPicPr>
                         </pic:nvPicPr>
                         <pic:blipFill>
-                          <a:blip r:embed="rId68"/>
+                          <a:blip r:embed="rId69"/>
                           <a:stretch>
                             <a:fillRect/>
                           </a:stretch>
@@ -18334,9 +20735,9 @@
         </w:tc>
       </w:tr>
     </w:tbl>
-    <w:bookmarkEnd w:id="71"/>
     <w:bookmarkEnd w:id="72"/>
-    <w:bookmarkStart w:id="97" w:name="X3fdb1d76157f7a3bb2660252df95ef70aee9708"/>
+    <w:bookmarkEnd w:id="73"/>
+    <w:bookmarkStart w:id="98" w:name="X3fdb1d76157f7a3bb2660252df95ef70aee9708"/>
     <w:p>
       <w:pPr>
         <w:pStyle w:val="Heading2"/>
@@ -18386,7 +20787,7 @@
               <w:spacing w:before="16" w:after="64"/>
             </w:pPr>
           </w:p>
-          <w:bookmarkStart w:id="73" w:name="rem-snm-no-survival"/>
+          <w:bookmarkStart w:id="74" w:name="rem-snm-no-survival"/>
           <w:p>
             <w:pPr>
               <w:pStyle w:val="BodyText"/>
@@ -18473,7 +20874,7 @@
               <w:t xml:space="preserve">so they cannot give us survivals or hazards.</w:t>
             </w:r>
           </w:p>
-          <w:bookmarkEnd w:id="73"/>
+          <w:bookmarkEnd w:id="74"/>
         </w:tc>
       </w:tr>
     </w:tbl>
@@ -18491,7 +20892,7 @@
         <w:t xml:space="preserve">since structural nested logistic models are hard to extend to treatments that vary over time (Technical Point 14.1).</w:t>
       </w:r>
     </w:p>
-    <w:bookmarkStart w:id="77" w:name="X007052f024a4babf54ac850edd624c01ea84a23"/>
+    <w:bookmarkStart w:id="78" w:name="X007052f024a4babf54ac850edd624c01ea84a23"/>
     <w:p>
       <w:pPr>
         <w:pStyle w:val="Heading3"/>
@@ -18534,7 +20935,7 @@
               <w:spacing w:before="16" w:after="64"/>
             </w:pPr>
           </w:p>
-          <w:bookmarkStart w:id="74" w:name="rem-snm-survival-models"/>
+          <w:bookmarkStart w:id="75" w:name="rem-snm-survival-models"/>
           <w:p>
             <w:pPr>
               <w:pStyle w:val="BodyText"/>
@@ -18558,7 +20959,7 @@
               <w:pStyle w:val="Compact"/>
               <w:numPr>
                 <w:ilvl w:val="0"/>
-                <w:numId w:val="1007"/>
+                <w:numId w:val="1008"/>
               </w:numPr>
             </w:pPr>
             <w:r>
@@ -18598,7 +20999,7 @@
               <w:pStyle w:val="Compact"/>
               <w:numPr>
                 <w:ilvl w:val="0"/>
-                <w:numId w:val="1007"/>
+                <w:numId w:val="1008"/>
               </w:numPr>
             </w:pPr>
             <w:r>
@@ -18635,7 +21036,7 @@
               <w:pStyle w:val="Compact"/>
               <w:numPr>
                 <w:ilvl w:val="0"/>
-                <w:numId w:val="1007"/>
+                <w:numId w:val="1008"/>
               </w:numPr>
             </w:pPr>
             <w:r>
@@ -18661,7 +21062,7 @@
               <w:t xml:space="preserve">.</w:t>
             </w:r>
           </w:p>
-          <w:bookmarkEnd w:id="74"/>
+          <w:bookmarkEnd w:id="75"/>
         </w:tc>
       </w:tr>
     </w:tbl>
@@ -18669,7 +21070,7 @@
       <w:pPr>
         <w:pStyle w:val="FirstParagraph"/>
       </w:pPr>
-      <w:ins w:id="79" w:author="PR Preview" w:date="2024-01-01T00:00:00Z">
+      <w:ins w:id="82" w:author="PR Preview" w:date="2024-01-01T00:00:00Z">
         <w:r>
           <w:t xml:space="preserve"> </w:t>
         </w:r>
@@ -18716,12 +21117,12 @@
                 <wp:inline>
                   <wp:extent cx="152400" cy="152400"/>
                   <wp:effectExtent b="0" l="0" r="0" t="0"/>
-                  <wp:docPr descr="" title="" id="75" name="Picture"/>
+                  <wp:docPr descr="" title="" id="76" name="Picture"/>
                   <a:graphic>
                     <a:graphicData uri="http://schemas.openxmlformats.org/drawingml/2006/picture">
                       <pic:pic>
                         <pic:nvPicPr>
-                          <pic:cNvPr descr="/opt/quarto/share/formats/docx/note.png" id="76" name="Picture"/>
+                          <pic:cNvPr descr="/opt/quarto/share/formats/docx/note.png" id="77" name="Picture"/>
                           <pic:cNvPicPr>
                             <a:picLocks noChangeArrowheads="1" noChangeAspect="1"/>
                           </pic:cNvPicPr>
@@ -19734,8 +22135,8 @@
         </w:tc>
       </w:tr>
     </w:tbl>
-    <w:bookmarkEnd w:id="77"/>
-    <w:bookmarkStart w:id="82" w:name="structural-nested-aft-models"/>
+    <w:bookmarkEnd w:id="78"/>
+    <w:bookmarkStart w:id="83" w:name="structural-nested-aft-models"/>
     <w:p>
       <w:pPr>
         <w:pStyle w:val="Heading3"/>
@@ -19778,7 +22179,7 @@
               <w:spacing w:before="16" w:after="64"/>
             </w:pPr>
           </w:p>
-          <w:bookmarkStart w:id="78" w:name="def-structural-nested-aft"/>
+          <w:bookmarkStart w:id="79" w:name="def-structural-nested-aft"/>
           <w:p>
             <w:pPr>
               <w:pStyle w:val="BodyText"/>
@@ -20151,7 +22552,7 @@
               <w:pStyle w:val="Compact"/>
               <w:numPr>
                 <w:ilvl w:val="0"/>
-                <w:numId w:val="1008"/>
+                <w:numId w:val="1009"/>
               </w:numPr>
             </w:pPr>
             <m:oMath>
@@ -20186,7 +22587,7 @@
               <w:pStyle w:val="Compact"/>
               <w:numPr>
                 <w:ilvl w:val="0"/>
-                <w:numId w:val="1008"/>
+                <w:numId w:val="1009"/>
               </w:numPr>
             </w:pPr>
             <m:oMath>
@@ -20221,7 +22622,7 @@
               <w:pStyle w:val="Compact"/>
               <w:numPr>
                 <w:ilvl w:val="0"/>
-                <w:numId w:val="1008"/>
+                <w:numId w:val="1009"/>
               </w:numPr>
             </w:pPr>
             <m:oMath>
@@ -20251,7 +22652,7 @@
               <w:t xml:space="preserve">: treatment does not affect survival time</w:t>
             </w:r>
           </w:p>
-          <w:bookmarkEnd w:id="78"/>
+          <w:bookmarkEnd w:id="79"/>
         </w:tc>
       </w:tr>
     </w:tbl>
@@ -20285,12 +22686,12 @@
       <w:pPr>
         <w:pStyle w:val="BodyText"/>
       </w:pPr>
-      <w:ins w:id="82" w:author="PR Preview" w:date="2024-01-01T00:00:00Z">
+      <w:ins w:id="85" w:author="PR Preview" w:date="2024-01-01T00:00:00Z">
         <w:r>
           <w:t xml:space="preserve">If the effect varies with covariates</w:t>
         </w:r>
       </w:ins>
-      <w:ins w:id="82" w:author="PR Preview" w:date="2024-01-01T00:00:00Z">
+      <w:ins w:id="85" w:author="PR Preview" w:date="2024-01-01T00:00:00Z">
         <w:r>
           <w:t xml:space="preserve"> </w:t>
         </w:r>
@@ -20300,12 +22701,12 @@
           <m:t>L</m:t>
         </m:r>
       </m:oMath>
-      <w:ins w:id="82" w:author="PR Preview" w:date="2024-01-01T00:00:00Z">
+      <w:ins w:id="85" w:author="PR Preview" w:date="2024-01-01T00:00:00Z">
         <w:r>
           <w:t xml:space="preserve">, a more general structural AFT model is</w:t>
         </w:r>
       </w:ins>
-      <w:ins w:id="82" w:author="PR Preview" w:date="2024-01-01T00:00:00Z">
+      <w:ins w:id="85" w:author="PR Preview" w:date="2024-01-01T00:00:00Z">
         <w:r>
           <w:t xml:space="preserve"> </w:t>
         </w:r>
@@ -20438,22 +22839,22 @@
           </m:e>
         </m:d>
       </m:oMath>
-      <w:ins w:id="82" w:author="PR Preview" w:date="2024-01-01T00:00:00Z">
+      <w:ins w:id="85" w:author="PR Preview" w:date="2024-01-01T00:00:00Z">
         <w:r>
           <w:t xml:space="preserve">,</w:t>
         </w:r>
       </w:ins>
-      <w:ins w:id="82" w:author="PR Preview" w:date="2024-01-01T00:00:00Z">
+      <w:ins w:id="85" w:author="PR Preview" w:date="2024-01-01T00:00:00Z">
         <w:r>
           <w:t xml:space="preserve"> </w:t>
         </w:r>
       </w:ins>
-      <w:ins w:id="82" w:author="PR Preview" w:date="2024-01-01T00:00:00Z">
+      <w:ins w:id="85" w:author="PR Preview" w:date="2024-01-01T00:00:00Z">
         <w:r>
           <w:t xml:space="preserve">with</w:t>
         </w:r>
       </w:ins>
-      <w:ins w:id="82" w:author="PR Preview" w:date="2024-01-01T00:00:00Z">
+      <w:ins w:id="85" w:author="PR Preview" w:date="2024-01-01T00:00:00Z">
         <w:r>
           <w:t xml:space="preserve"> </w:t>
         </w:r>
@@ -20472,17 +22873,17 @@
           </m:sub>
         </m:sSub>
       </m:oMath>
-      <w:ins w:id="82" w:author="PR Preview" w:date="2024-01-01T00:00:00Z">
+      <w:ins w:id="85" w:author="PR Preview" w:date="2024-01-01T00:00:00Z">
         <w:r>
           <w:t xml:space="preserve"> </w:t>
         </w:r>
       </w:ins>
-      <w:ins w:id="82" w:author="PR Preview" w:date="2024-01-01T00:00:00Z">
+      <w:ins w:id="85" w:author="PR Preview" w:date="2024-01-01T00:00:00Z">
         <w:r>
           <w:t xml:space="preserve">and the vector</w:t>
         </w:r>
       </w:ins>
-      <w:ins w:id="82" w:author="PR Preview" w:date="2024-01-01T00:00:00Z">
+      <w:ins w:id="85" w:author="PR Preview" w:date="2024-01-01T00:00:00Z">
         <w:r>
           <w:t xml:space="preserve"> </w:t>
         </w:r>
@@ -20501,12 +22902,12 @@
           </m:sub>
         </m:sSub>
       </m:oMath>
-      <w:ins w:id="82" w:author="PR Preview" w:date="2024-01-01T00:00:00Z">
+      <w:ins w:id="85" w:author="PR Preview" w:date="2024-01-01T00:00:00Z">
         <w:r>
           <w:t xml:space="preserve"> </w:t>
         </w:r>
       </w:ins>
-      <w:ins w:id="82" w:author="PR Preview" w:date="2024-01-01T00:00:00Z">
+      <w:ins w:id="85" w:author="PR Preview" w:date="2024-01-01T00:00:00Z">
         <w:r>
           <w:t xml:space="preserve">common to all individuals.</w:t>
         </w:r>
@@ -20546,7 +22947,7 @@
               <w:spacing w:before="16" w:after="64"/>
             </w:pPr>
           </w:p>
-          <w:bookmarkStart w:id="79" w:name="prp-aft-observed-time"/>
+          <w:bookmarkStart w:id="80" w:name="prp-aft-observed-time"/>
           <w:p>
             <w:pPr>
               <w:pStyle w:val="BodyText"/>
@@ -20861,7 +23262,7 @@
               </m:oMath>
             </m:oMathPara>
           </w:p>
-          <w:bookmarkEnd w:id="79"/>
+          <w:bookmarkEnd w:id="80"/>
         </w:tc>
       </w:tr>
     </w:tbl>
@@ -20869,7 +23270,7 @@
       <w:pPr>
         <w:pStyle w:val="FirstParagraph"/>
       </w:pPr>
-      <w:ins w:id="83" w:author="PR Preview" w:date="2024-01-01T00:00:00Z">
+      <w:ins w:id="86" w:author="PR Preview" w:date="2024-01-01T00:00:00Z">
         <w:r>
           <w:t xml:space="preserve"> </w:t>
         </w:r>
@@ -21286,7 +23687,7 @@
       <w:pPr>
         <w:pStyle w:val="BodyText"/>
       </w:pPr>
-      <w:ins w:id="84" w:author="PR Preview" w:date="2024-01-01T00:00:00Z">
+      <w:ins w:id="87" w:author="PR Preview" w:date="2024-01-01T00:00:00Z">
         <w:r>
           <w:t xml:space="preserve">The parameters of this AFT model can be estimated by g-estimation, modified to allow for administrative censoring.</w:t>
         </w:r>
@@ -21333,12 +23734,12 @@
                 <wp:inline>
                   <wp:extent cx="152400" cy="152400"/>
                   <wp:effectExtent b="0" l="0" r="0" t="0"/>
-                  <wp:docPr descr="" title="" id="80" name="Picture"/>
+                  <wp:docPr descr="" title="" id="81" name="Picture"/>
                   <a:graphic>
                     <a:graphicData uri="http://schemas.openxmlformats.org/drawingml/2006/picture">
                       <pic:pic>
                         <pic:nvPicPr>
-                          <pic:cNvPr descr="/opt/quarto/share/formats/docx/warning.png" id="81" name="Picture"/>
+                          <pic:cNvPr descr="/opt/quarto/share/formats/docx/warning.png" id="82" name="Picture"/>
                           <pic:cNvPicPr>
                             <a:picLocks noChangeArrowheads="1" noChangeAspect="1"/>
                           </pic:cNvPicPr>
@@ -21723,8 +24124,8 @@
         </w:tc>
       </w:tr>
     </w:tbl>
-    <w:bookmarkEnd w:id="82"/>
-    <w:bookmarkStart w:id="86" w:name="g-estimation-without-censoring"/>
+    <w:bookmarkEnd w:id="83"/>
+    <w:bookmarkStart w:id="87" w:name="g-estimation-without-censoring"/>
     <w:p>
       <w:pPr>
         <w:pStyle w:val="Heading3"/>
@@ -21851,12 +24252,12 @@
         <w:t xml:space="preserve">g-estimation would follow Section 14.5:</w:t>
       </w:r>
     </w:p>
-    <w:bookmarkStart w:id="83" w:name="alg-g-estimation-aft"/>
+    <w:bookmarkStart w:id="84" w:name="alg-g-estimation-aft"/>
     <w:p>
       <w:pPr>
         <w:pStyle w:val="BodyText"/>
       </w:pPr>
-      <w:ins w:id="1087" w:author="PR Preview" w:date="2024-01-01T00:00:00Z">
+      <w:ins w:id="1090" w:author="PR Preview" w:date="2024-01-01T00:00:00Z">
         <w:r>
           <w:rPr>
             <w:b/>
@@ -21865,12 +24266,12 @@
           <w:t xml:space="preserve">Algorithm 3 (G-estimation of a structural AFT model without censoring)</w:t>
         </w:r>
       </w:ins>
-      <w:ins w:id="1087" w:author="PR Preview" w:date="2024-01-01T00:00:00Z">
+      <w:ins w:id="1090" w:author="PR Preview" w:date="2024-01-01T00:00:00Z">
         <w:r>
           <w:t xml:space="preserve"> </w:t>
         </w:r>
       </w:ins>
-      <w:ins w:id="1087" w:author="PR Preview" w:date="2024-01-01T00:00:00Z">
+      <w:ins w:id="1090" w:author="PR Preview" w:date="2024-01-01T00:00:00Z">
         <w:r>
           <w:t xml:space="preserve"> </w:t>
         </w:r>
@@ -21881,7 +24282,7 @@
         <w:pStyle w:val="Compact"/>
         <w:numPr>
           <w:ilvl w:val="0"/>
-          <w:numId w:val="1009"/>
+          <w:numId w:val="1010"/>
         </w:numPr>
       </w:pPr>
       <w:r>
@@ -22025,7 +24426,7 @@
         <w:pStyle w:val="Compact"/>
         <w:numPr>
           <w:ilvl w:val="0"/>
-          <w:numId w:val="1009"/>
+          <w:numId w:val="1010"/>
         </w:numPr>
       </w:pPr>
       <w:r>
@@ -22238,7 +24639,7 @@
         <w:t xml:space="preserve">.</w:t>
       </w:r>
     </w:p>
-    <w:bookmarkEnd w:id="83"/>
+    <w:bookmarkEnd w:id="84"/>
     <w:tbl>
       <w:tblPr>
         <w:tblStyle w:val="Table"/>
@@ -22280,18 +24681,18 @@
                 <wp:inline>
                   <wp:extent cx="152400" cy="152400"/>
                   <wp:effectExtent b="0" l="0" r="0" t="0"/>
-                  <wp:docPr descr="" title="" id="84" name="Picture"/>
+                  <wp:docPr descr="" title="" id="85" name="Picture"/>
                   <a:graphic>
                     <a:graphicData uri="http://schemas.openxmlformats.org/drawingml/2006/picture">
                       <pic:pic>
                         <pic:nvPicPr>
-                          <pic:cNvPr descr="/opt/quarto/share/formats/docx/tip.png" id="85" name="Picture"/>
+                          <pic:cNvPr descr="/opt/quarto/share/formats/docx/tip.png" id="86" name="Picture"/>
                           <pic:cNvPicPr>
                             <a:picLocks noChangeArrowheads="1" noChangeAspect="1"/>
                           </pic:cNvPicPr>
                         </pic:nvPicPr>
                         <pic:blipFill>
-                          <a:blip r:embed="rId68"/>
+                          <a:blip r:embed="rId69"/>
                           <a:stretch>
                             <a:fillRect/>
                           </a:stretch>
@@ -22361,8 +24762,8 @@
         </w:tc>
       </w:tr>
     </w:tbl>
-    <w:bookmarkEnd w:id="86"/>
-    <w:bookmarkStart w:id="89" w:name="Xef19479ea2784059f17506e0ff97f4b2b271fc9"/>
+    <w:bookmarkEnd w:id="87"/>
+    <w:bookmarkStart w:id="90" w:name="Xef19479ea2784059f17506e0ff97f4b2b271fc9"/>
     <w:p>
       <w:pPr>
         <w:pStyle w:val="Heading3"/>
@@ -22549,7 +24950,7 @@
       <w:tr>
         <w:tc>
           <w:tcPr/>
-          <w:bookmarkStart w:id="87" w:name="tbl-aft-example"/>
+          <w:bookmarkStart w:id="88" w:name="tbl-aft-example"/>
           <w:p>
             <w:pPr>
               <w:jc w:val="center"/>
@@ -22776,7 +25177,7 @@
               </w:tc>
             </w:tr>
           </w:tbl>
-          <w:bookmarkEnd w:id="87"/>
+          <w:bookmarkEnd w:id="88"/>
           <w:p/>
         </w:tc>
       </w:tr>
@@ -23141,7 +25542,7 @@
               <w:spacing w:before="16" w:after="64"/>
             </w:pPr>
           </w:p>
-          <w:bookmarkStart w:id="88" w:name="exm-aft-selection-bias"/>
+          <w:bookmarkStart w:id="89" w:name="exm-aft-selection-bias"/>
           <w:p>
             <w:pPr>
               <w:pStyle w:val="BodyText"/>
@@ -23202,7 +25603,7 @@
               <w:pStyle w:val="Compact"/>
               <w:numPr>
                 <w:ilvl w:val="0"/>
-                <w:numId w:val="1010"/>
+                <w:numId w:val="1011"/>
               </w:numPr>
             </w:pPr>
             <w:r>
@@ -23214,7 +25615,7 @@
               <w:pStyle w:val="Compact"/>
               <w:numPr>
                 <w:ilvl w:val="0"/>
-                <w:numId w:val="1010"/>
+                <w:numId w:val="1011"/>
               </w:numPr>
             </w:pPr>
             <w:r>
@@ -23226,7 +25627,7 @@
               <w:pStyle w:val="Compact"/>
               <w:numPr>
                 <w:ilvl w:val="0"/>
-                <w:numId w:val="1010"/>
+                <w:numId w:val="1011"/>
               </w:numPr>
             </w:pPr>
             <w:r>
@@ -23265,12 +25666,12 @@
               <w:t xml:space="preserve">This selection bias (Chapter 8) occurs whenever treatment changes survival time at all.</w:t>
             </w:r>
           </w:p>
-          <w:bookmarkEnd w:id="88"/>
+          <w:bookmarkEnd w:id="89"/>
         </w:tc>
       </w:tr>
     </w:tbl>
-    <w:bookmarkEnd w:id="89"/>
-    <w:bookmarkStart w:id="93" w:name="artificial-censoring"/>
+    <w:bookmarkEnd w:id="90"/>
+    <w:bookmarkStart w:id="94" w:name="artificial-censoring"/>
     <w:p>
       <w:pPr>
         <w:pStyle w:val="Heading3"/>
@@ -23313,7 +25714,7 @@
               <w:spacing w:before="16" w:after="64"/>
             </w:pPr>
           </w:p>
-          <w:bookmarkStart w:id="90" w:name="def-artificial-censoring"/>
+          <w:bookmarkStart w:id="91" w:name="def-artificial-censoring"/>
           <w:p>
             <w:pPr>
               <w:pStyle w:val="BodyText"/>
@@ -23547,7 +25948,7 @@
               <w:t xml:space="preserve">.</w:t>
             </w:r>
           </w:p>
-          <w:bookmarkEnd w:id="90"/>
+          <w:bookmarkEnd w:id="91"/>
         </w:tc>
       </w:tr>
     </w:tbl>
@@ -23723,12 +26124,12 @@
                 <wp:inline>
                   <wp:extent cx="152400" cy="152400"/>
                   <wp:effectExtent b="0" l="0" r="0" t="0"/>
-                  <wp:docPr descr="" title="" id="91" name="Picture"/>
+                  <wp:docPr descr="" title="" id="92" name="Picture"/>
                   <a:graphic>
                     <a:graphicData uri="http://schemas.openxmlformats.org/drawingml/2006/picture">
                       <pic:pic>
                         <pic:nvPicPr>
-                          <pic:cNvPr descr="/opt/quarto/share/formats/docx/note.png" id="92" name="Picture"/>
+                          <pic:cNvPr descr="/opt/quarto/share/formats/docx/note.png" id="93" name="Picture"/>
                           <pic:cNvPicPr>
                             <a:picLocks noChangeArrowheads="1" noChangeAspect="1"/>
                           </pic:cNvPicPr>
@@ -24089,7 +26490,7 @@
               <w:pStyle w:val="Compact"/>
               <w:numPr>
                 <w:ilvl w:val="0"/>
-                <w:numId w:val="1011"/>
+                <w:numId w:val="1012"/>
               </w:numPr>
             </w:pPr>
             <w:r>
@@ -24193,7 +26594,7 @@
               <w:pStyle w:val="Compact"/>
               <w:numPr>
                 <w:ilvl w:val="0"/>
-                <w:numId w:val="1011"/>
+                <w:numId w:val="1012"/>
               </w:numPr>
             </w:pPr>
             <w:r>
@@ -24317,7 +26718,7 @@
               <w:pStyle w:val="Compact"/>
               <w:numPr>
                 <w:ilvl w:val="0"/>
-                <w:numId w:val="1011"/>
+                <w:numId w:val="1012"/>
               </w:numPr>
             </w:pPr>
             <w:r>
@@ -24827,8 +27228,8 @@
         </w:tc>
       </w:tr>
     </w:tbl>
-    <w:bookmarkEnd w:id="93"/>
-    <w:bookmarkStart w:id="96" w:name="nhefs-results-and-practical-obstacles"/>
+    <w:bookmarkEnd w:id="94"/>
+    <w:bookmarkStart w:id="97" w:name="nhefs-results-and-practical-obstacles"/>
     <w:p>
       <w:pPr>
         <w:pStyle w:val="Heading3"/>
@@ -24871,7 +27272,7 @@
               <w:spacing w:before="16" w:after="64"/>
             </w:pPr>
           </w:p>
-          <w:bookmarkStart w:id="94" w:name="exm-nhefs-aft-g-estimation"/>
+          <w:bookmarkStart w:id="95" w:name="exm-nhefs-aft-g-estimation"/>
           <w:p>
             <w:pPr>
               <w:pStyle w:val="BodyText"/>
@@ -25187,7 +27588,7 @@
               <w:t xml:space="preserve">so quitting appears to have little effect on time to death.</w:t>
             </w:r>
           </w:p>
-          <w:bookmarkEnd w:id="94"/>
+          <w:bookmarkEnd w:id="95"/>
         </w:tc>
       </w:tr>
     </w:tbl>
@@ -25290,7 +27691,7 @@
               <w:spacing w:before="16" w:after="64"/>
             </w:pPr>
           </w:p>
-          <w:bookmarkStart w:id="95" w:name="rem-snm-rarely-used"/>
+          <w:bookmarkStart w:id="96" w:name="rem-snm-rarely-used"/>
           <w:p>
             <w:pPr>
               <w:pStyle w:val="BodyText"/>
@@ -25351,13 +27752,13 @@
               <w:t xml:space="preserve">particularly when the AFT model is neither deterministic nor rank-preserving.</w:t>
             </w:r>
           </w:p>
-          <w:bookmarkEnd w:id="95"/>
+          <w:bookmarkEnd w:id="96"/>
         </w:tc>
       </w:tr>
     </w:tbl>
-    <w:bookmarkEnd w:id="96"/>
     <w:bookmarkEnd w:id="97"/>
-    <w:bookmarkStart w:id="100" w:name="summary"/>
+    <w:bookmarkEnd w:id="98"/>
+    <w:bookmarkStart w:id="101" w:name="summary"/>
     <w:p>
       <w:pPr>
         <w:pStyle w:val="Heading2"/>
@@ -25393,7 +27794,7 @@
         <w:pStyle w:val="Compact"/>
         <w:numPr>
           <w:ilvl w:val="0"/>
-          <w:numId w:val="1012"/>
+          <w:numId w:val="1013"/>
         </w:numPr>
       </w:pPr>
       <w:r>
@@ -25412,7 +27813,7 @@
         <w:pStyle w:val="Compact"/>
         <w:numPr>
           <w:ilvl w:val="0"/>
-          <w:numId w:val="1012"/>
+          <w:numId w:val="1013"/>
         </w:numPr>
       </w:pPr>
       <w:r>
@@ -25585,7 +27986,7 @@
         <w:pStyle w:val="Compact"/>
         <w:numPr>
           <w:ilvl w:val="0"/>
-          <w:numId w:val="1012"/>
+          <w:numId w:val="1013"/>
         </w:numPr>
       </w:pPr>
       <w:r>
@@ -25604,7 +28005,7 @@
         <w:pStyle w:val="Compact"/>
         <w:numPr>
           <w:ilvl w:val="0"/>
-          <w:numId w:val="1012"/>
+          <w:numId w:val="1013"/>
         </w:numPr>
       </w:pPr>
       <w:r>
@@ -25629,7 +28030,7 @@
         <w:pStyle w:val="Compact"/>
         <w:numPr>
           <w:ilvl w:val="0"/>
-          <w:numId w:val="1012"/>
+          <w:numId w:val="1013"/>
         </w:numPr>
       </w:pPr>
       <w:r>
@@ -25726,7 +28127,7 @@
         <w:pStyle w:val="Compact"/>
         <w:numPr>
           <w:ilvl w:val="0"/>
-          <w:numId w:val="1012"/>
+          <w:numId w:val="1013"/>
         </w:numPr>
       </w:pPr>
       <w:r>
@@ -25765,7 +28166,7 @@
         <w:pStyle w:val="Compact"/>
         <w:numPr>
           <w:ilvl w:val="0"/>
-          <w:numId w:val="1012"/>
+          <w:numId w:val="1013"/>
         </w:numPr>
       </w:pPr>
       <w:r>
@@ -25777,46 +28178,6 @@
       </w:r>
       <w:r>
         <w:t xml:space="preserve">: Standardizes conditional survivals to the covariate distribution</w:t>
-      </w:r>
-    </w:p>
-    <w:p>
-      <w:pPr>
-        <w:pStyle w:val="Compact"/>
-        <w:numPr>
-          <w:ilvl w:val="0"/>
-          <w:numId w:val="1012"/>
-        </w:numPr>
-      </w:pPr>
-      <w:r>
-        <w:rPr>
-          <w:b/>
-          <w:bCs/>
-        </w:rPr>
-        <w:t xml:space="preserve">G-estimation of structural nested AFT models</w:t>
-      </w:r>
-      <w:r>
-        <w:t xml:space="preserve">: Models the ratio of survival times;</w:t>
-      </w:r>
-      <w:r>
-        <w:t xml:space="preserve"> </w:t>
-      </w:r>
-      <w:r>
-        <w:t xml:space="preserve">requires artificial censoring to handle administrative censoring</w:t>
-      </w:r>
-    </w:p>
-    <w:p>
-      <w:pPr>
-        <w:pStyle w:val="FirstParagraph"/>
-      </w:pPr>
-      <w:r>
-        <w:rPr>
-          <w:b/>
-          <w:bCs/>
-        </w:rPr>
-        <w:t xml:space="preserve">Causal estimands for survival outcomes</w:t>
-      </w:r>
-      <w:r>
-        <w:t xml:space="preserve">:</w:t>
       </w:r>
     </w:p>
     <w:p>
@@ -25825,6 +28186,46 @@
         <w:numPr>
           <w:ilvl w:val="0"/>
           <w:numId w:val="1013"/>
+        </w:numPr>
+      </w:pPr>
+      <w:r>
+        <w:rPr>
+          <w:b/>
+          <w:bCs/>
+        </w:rPr>
+        <w:t xml:space="preserve">G-estimation of structural nested AFT models</w:t>
+      </w:r>
+      <w:r>
+        <w:t xml:space="preserve">: Models the ratio of survival times;</w:t>
+      </w:r>
+      <w:r>
+        <w:t xml:space="preserve"> </w:t>
+      </w:r>
+      <w:r>
+        <w:t xml:space="preserve">requires artificial censoring to handle administrative censoring</w:t>
+      </w:r>
+    </w:p>
+    <w:p>
+      <w:pPr>
+        <w:pStyle w:val="FirstParagraph"/>
+      </w:pPr>
+      <w:r>
+        <w:rPr>
+          <w:b/>
+          <w:bCs/>
+        </w:rPr>
+        <w:t xml:space="preserve">Causal estimands for survival outcomes</w:t>
+      </w:r>
+      <w:r>
+        <w:t xml:space="preserve">:</w:t>
+      </w:r>
+    </w:p>
+    <w:p>
+      <w:pPr>
+        <w:pStyle w:val="Compact"/>
+        <w:numPr>
+          <w:ilvl w:val="0"/>
+          <w:numId w:val="1014"/>
         </w:numPr>
       </w:pPr>
       <w:r>
@@ -25960,7 +28361,7 @@
         <w:pStyle w:val="Compact"/>
         <w:numPr>
           <w:ilvl w:val="0"/>
-          <w:numId w:val="1013"/>
+          <w:numId w:val="1014"/>
         </w:numPr>
       </w:pPr>
       <w:r>
@@ -26114,7 +28515,7 @@
         <w:pStyle w:val="Compact"/>
         <w:numPr>
           <w:ilvl w:val="0"/>
-          <w:numId w:val="1014"/>
+          <w:numId w:val="1015"/>
         </w:numPr>
       </w:pPr>
       <w:r>
@@ -26126,7 +28527,7 @@
         <w:pStyle w:val="Compact"/>
         <w:numPr>
           <w:ilvl w:val="0"/>
-          <w:numId w:val="1014"/>
+          <w:numId w:val="1015"/>
         </w:numPr>
       </w:pPr>
       <w:r>
@@ -26144,7 +28545,7 @@
         <w:pStyle w:val="Compact"/>
         <w:numPr>
           <w:ilvl w:val="0"/>
-          <w:numId w:val="1014"/>
+          <w:numId w:val="1015"/>
         </w:numPr>
       </w:pPr>
       <w:r>
@@ -26188,7 +28589,7 @@
         <w:pStyle w:val="Compact"/>
         <w:numPr>
           <w:ilvl w:val="0"/>
-          <w:numId w:val="1014"/>
+          <w:numId w:val="1015"/>
         </w:numPr>
       </w:pPr>
       <w:r>
@@ -26346,7 +28747,7 @@
         <w:pStyle w:val="Compact"/>
         <w:numPr>
           <w:ilvl w:val="0"/>
-          <w:numId w:val="1015"/>
+          <w:numId w:val="1016"/>
         </w:numPr>
       </w:pPr>
       <w:r>
@@ -26376,7 +28777,7 @@
         <w:pStyle w:val="Compact"/>
         <w:numPr>
           <w:ilvl w:val="0"/>
-          <w:numId w:val="1015"/>
+          <w:numId w:val="1016"/>
         </w:numPr>
       </w:pPr>
       <w:r>
@@ -26388,7 +28789,7 @@
         <w:pStyle w:val="Compact"/>
         <w:numPr>
           <w:ilvl w:val="0"/>
-          <w:numId w:val="1015"/>
+          <w:numId w:val="1016"/>
         </w:numPr>
       </w:pPr>
       <w:r>
@@ -26436,12 +28837,12 @@
                 <wp:inline>
                   <wp:extent cx="152400" cy="152400"/>
                   <wp:effectExtent b="0" l="0" r="0" t="0"/>
-                  <wp:docPr descr="" title="" id="98" name="Picture"/>
+                  <wp:docPr descr="" title="" id="99" name="Picture"/>
                   <a:graphic>
                     <a:graphicData uri="http://schemas.openxmlformats.org/drawingml/2006/picture">
                       <pic:pic>
                         <pic:nvPicPr>
-                          <pic:cNvPr descr="/opt/quarto/share/formats/docx/warning.png" id="99" name="Picture"/>
+                          <pic:cNvPr descr="/opt/quarto/share/formats/docx/warning.png" id="100" name="Picture"/>
                           <pic:cNvPicPr>
                             <a:picLocks noChangeArrowheads="1" noChangeAspect="1"/>
                           </pic:cNvPicPr>
@@ -26501,7 +28902,7 @@
               <w:pStyle w:val="Compact"/>
               <w:numPr>
                 <w:ilvl w:val="0"/>
-                <w:numId w:val="1016"/>
+                <w:numId w:val="1017"/>
               </w:numPr>
             </w:pPr>
             <w:r>
@@ -26513,7 +28914,7 @@
               <w:pStyle w:val="Compact"/>
               <w:numPr>
                 <w:ilvl w:val="0"/>
-                <w:numId w:val="1016"/>
+                <w:numId w:val="1017"/>
               </w:numPr>
             </w:pPr>
             <w:r>
@@ -26525,7 +28926,7 @@
               <w:pStyle w:val="Compact"/>
               <w:numPr>
                 <w:ilvl w:val="0"/>
-                <w:numId w:val="1016"/>
+                <w:numId w:val="1017"/>
               </w:numPr>
             </w:pPr>
             <w:r>
@@ -26537,7 +28938,7 @@
               <w:pStyle w:val="Compact"/>
               <w:numPr>
                 <w:ilvl w:val="0"/>
-                <w:numId w:val="1016"/>
+                <w:numId w:val="1017"/>
               </w:numPr>
             </w:pPr>
             <w:r>
@@ -26569,8 +28970,8 @@
         <w:t xml:space="preserve">The g-formula and IP weighting remain powerful tools, but they must account for the time-varying nature of both treatment and confounders.</w:t>
       </w:r>
     </w:p>
-    <w:bookmarkEnd w:id="100"/>
-    <w:bookmarkStart w:id="104" w:name="references"/>
+    <w:bookmarkEnd w:id="101"/>
+    <w:bookmarkStart w:id="105" w:name="references"/>
     <w:p>
       <w:pPr>
         <w:pStyle w:val="Heading2"/>
@@ -26586,8 +28987,8 @@
         </w:pict>
       </w:r>
     </w:p>
-    <w:bookmarkStart w:id="103" w:name="refs"/>
-    <w:bookmarkStart w:id="102" w:name="ref-hernan2020causal"/>
+    <w:bookmarkStart w:id="104" w:name="refs"/>
+    <w:bookmarkStart w:id="103" w:name="ref-hernan2020causal"/>
     <w:p>
       <w:pPr>
         <w:pStyle w:val="Bibliography"/>
@@ -26611,7 +29012,7 @@
       <w:r>
         <w:t xml:space="preserve"> </w:t>
       </w:r>
-      <w:hyperlink r:id="rId101">
+      <w:hyperlink r:id="rId102">
         <w:r>
           <w:rPr>
             <w:rStyle w:val="Hyperlink"/>
@@ -26623,9 +29024,9 @@
         <w:t xml:space="preserve">.</w:t>
       </w:r>
     </w:p>
-    <w:bookmarkEnd w:id="102"/>
     <w:bookmarkEnd w:id="103"/>
     <w:bookmarkEnd w:id="104"/>
+    <w:bookmarkEnd w:id="105"/>
     <w:sectPr>
       <w:footnotePr>
         <w:numRestart w:val="eachSect"/>
@@ -26952,6 +29353,9 @@
     <w:abstractNumId w:val="991"/>
   </w:num>
   <w:num w:numId="1009">
+    <w:abstractNumId w:val="991"/>
+  </w:num>
+  <w:num w:numId="1010">
     <w:abstractNumId w:val="99411"/>
     <w:lvlOverride w:ilvl="0">
       <w:startOverride w:val="1"/>
@@ -26981,13 +29385,13 @@
       <w:startOverride w:val="1"/>
     </w:lvlOverride>
   </w:num>
-  <w:num w:numId="1010">
-    <w:abstractNumId w:val="991"/>
-  </w:num>
   <w:num w:numId="1011">
     <w:abstractNumId w:val="991"/>
   </w:num>
   <w:num w:numId="1012">
+    <w:abstractNumId w:val="991"/>
+  </w:num>
+  <w:num w:numId="1013">
     <w:abstractNumId w:val="99411"/>
     <w:lvlOverride w:ilvl="0">
       <w:startOverride w:val="1"/>
@@ -27017,9 +29421,6 @@
       <w:startOverride w:val="1"/>
     </w:lvlOverride>
   </w:num>
-  <w:num w:numId="1013">
-    <w:abstractNumId w:val="991"/>
-  </w:num>
   <w:num w:numId="1014">
     <w:abstractNumId w:val="991"/>
   </w:num>
@@ -27027,6 +29428,9 @@
     <w:abstractNumId w:val="991"/>
   </w:num>
   <w:num w:numId="1016">
+    <w:abstractNumId w:val="991"/>
+  </w:num>
+  <w:num w:numId="1017">
     <w:abstractNumId w:val="99411"/>
     <w:lvlOverride w:ilvl="0">
       <w:startOverride w:val="1"/>

</xml_diff>